<commit_message>
feat: add Tujuan,Manfaat, and Tools
</commit_message>
<xml_diff>
--- a/3325600003_Iklil Najmi Hamzah_Proyek Image Processing UAS.docx
+++ b/3325600003_Iklil Najmi Hamzah_Proyek Image Processing UAS.docx
@@ -5897,8 +5897,1039 @@
           <w:szCs w:val="24"/>
         </w:rPr>
       </w:pPr>
-      <w:bookmarkStart w:id="5" w:name="_GoBack"/>
-      <w:bookmarkEnd w:id="5"/>
+      <w:proofErr w:type="spellStart"/>
+      <w:r>
+        <w:rPr>
+          <w:rFonts w:ascii="Times New Roman" w:hAnsi="Times New Roman" w:cs="Times New Roman"/>
+          <w:sz w:val="24"/>
+          <w:szCs w:val="24"/>
+        </w:rPr>
+        <w:t>Memuat</w:t>
+      </w:r>
+      <w:proofErr w:type="spellEnd"/>
+      <w:r>
+        <w:rPr>
+          <w:rFonts w:ascii="Times New Roman" w:hAnsi="Times New Roman" w:cs="Times New Roman"/>
+          <w:sz w:val="24"/>
+          <w:szCs w:val="24"/>
+        </w:rPr>
+        <w:t xml:space="preserve"> dan </w:t>
+      </w:r>
+      <w:proofErr w:type="spellStart"/>
+      <w:r>
+        <w:rPr>
+          <w:rFonts w:ascii="Times New Roman" w:hAnsi="Times New Roman" w:cs="Times New Roman"/>
+          <w:sz w:val="24"/>
+          <w:szCs w:val="24"/>
+        </w:rPr>
+        <w:t>membaca</w:t>
+      </w:r>
+      <w:proofErr w:type="spellEnd"/>
+      <w:r>
+        <w:rPr>
+          <w:rFonts w:ascii="Times New Roman" w:hAnsi="Times New Roman" w:cs="Times New Roman"/>
+          <w:sz w:val="24"/>
+          <w:szCs w:val="24"/>
+        </w:rPr>
+        <w:t xml:space="preserve"> data </w:t>
+      </w:r>
+      <w:proofErr w:type="spellStart"/>
+      <w:r>
+        <w:rPr>
+          <w:rFonts w:ascii="Times New Roman" w:hAnsi="Times New Roman" w:cs="Times New Roman"/>
+          <w:sz w:val="24"/>
+          <w:szCs w:val="24"/>
+        </w:rPr>
+        <w:t>citra</w:t>
+      </w:r>
+      <w:proofErr w:type="spellEnd"/>
+      <w:r>
+        <w:rPr>
+          <w:rFonts w:ascii="Times New Roman" w:hAnsi="Times New Roman" w:cs="Times New Roman"/>
+          <w:sz w:val="24"/>
+          <w:szCs w:val="24"/>
+        </w:rPr>
+        <w:t xml:space="preserve"> </w:t>
+      </w:r>
+      <w:proofErr w:type="spellStart"/>
+      <w:r>
+        <w:rPr>
+          <w:rFonts w:ascii="Times New Roman" w:hAnsi="Times New Roman" w:cs="Times New Roman"/>
+          <w:sz w:val="24"/>
+          <w:szCs w:val="24"/>
+        </w:rPr>
+        <w:t>sampah</w:t>
+      </w:r>
+      <w:proofErr w:type="spellEnd"/>
+      <w:r>
+        <w:rPr>
+          <w:rFonts w:ascii="Times New Roman" w:hAnsi="Times New Roman" w:cs="Times New Roman"/>
+          <w:sz w:val="24"/>
+          <w:szCs w:val="24"/>
+        </w:rPr>
+        <w:t xml:space="preserve"> </w:t>
+      </w:r>
+      <w:proofErr w:type="spellStart"/>
+      <w:r>
+        <w:rPr>
+          <w:rFonts w:ascii="Times New Roman" w:hAnsi="Times New Roman" w:cs="Times New Roman"/>
+          <w:sz w:val="24"/>
+          <w:szCs w:val="24"/>
+        </w:rPr>
+        <w:t>menggunakan</w:t>
+      </w:r>
+      <w:proofErr w:type="spellEnd"/>
+      <w:r>
+        <w:rPr>
+          <w:rFonts w:ascii="Times New Roman" w:hAnsi="Times New Roman" w:cs="Times New Roman"/>
+          <w:sz w:val="24"/>
+          <w:szCs w:val="24"/>
+        </w:rPr>
+        <w:t xml:space="preserve"> library </w:t>
+      </w:r>
+      <w:proofErr w:type="spellStart"/>
+      <w:r>
+        <w:rPr>
+          <w:rFonts w:ascii="Times New Roman" w:hAnsi="Times New Roman" w:cs="Times New Roman"/>
+          <w:sz w:val="24"/>
+          <w:szCs w:val="24"/>
+        </w:rPr>
+        <w:t>opencv</w:t>
+      </w:r>
+      <w:proofErr w:type="spellEnd"/>
+      <w:r>
+        <w:rPr>
+          <w:rFonts w:ascii="Times New Roman" w:hAnsi="Times New Roman" w:cs="Times New Roman"/>
+          <w:sz w:val="24"/>
+          <w:szCs w:val="24"/>
+        </w:rPr>
+        <w:t xml:space="preserve"> </w:t>
+      </w:r>
+      <w:proofErr w:type="spellStart"/>
+      <w:r>
+        <w:rPr>
+          <w:rFonts w:ascii="Times New Roman" w:hAnsi="Times New Roman" w:cs="Times New Roman"/>
+          <w:sz w:val="24"/>
+          <w:szCs w:val="24"/>
+        </w:rPr>
+        <w:t>sebagai</w:t>
+      </w:r>
+      <w:proofErr w:type="spellEnd"/>
+      <w:r>
+        <w:rPr>
+          <w:rFonts w:ascii="Times New Roman" w:hAnsi="Times New Roman" w:cs="Times New Roman"/>
+          <w:sz w:val="24"/>
+          <w:szCs w:val="24"/>
+        </w:rPr>
+        <w:t xml:space="preserve"> </w:t>
+      </w:r>
+      <w:proofErr w:type="spellStart"/>
+      <w:r>
+        <w:rPr>
+          <w:rFonts w:ascii="Times New Roman" w:hAnsi="Times New Roman" w:cs="Times New Roman"/>
+          <w:sz w:val="24"/>
+          <w:szCs w:val="24"/>
+        </w:rPr>
+        <w:t>tahapan</w:t>
+      </w:r>
+      <w:proofErr w:type="spellEnd"/>
+      <w:r>
+        <w:rPr>
+          <w:rFonts w:ascii="Times New Roman" w:hAnsi="Times New Roman" w:cs="Times New Roman"/>
+          <w:sz w:val="24"/>
+          <w:szCs w:val="24"/>
+        </w:rPr>
+        <w:t xml:space="preserve"> </w:t>
+      </w:r>
+      <w:proofErr w:type="spellStart"/>
+      <w:r>
+        <w:rPr>
+          <w:rFonts w:ascii="Times New Roman" w:hAnsi="Times New Roman" w:cs="Times New Roman"/>
+          <w:sz w:val="24"/>
+          <w:szCs w:val="24"/>
+        </w:rPr>
+        <w:t>awal</w:t>
+      </w:r>
+      <w:proofErr w:type="spellEnd"/>
+      <w:r>
+        <w:rPr>
+          <w:rFonts w:ascii="Times New Roman" w:hAnsi="Times New Roman" w:cs="Times New Roman"/>
+          <w:sz w:val="24"/>
+          <w:szCs w:val="24"/>
+        </w:rPr>
+        <w:t xml:space="preserve"> </w:t>
+      </w:r>
+      <w:proofErr w:type="spellStart"/>
+      <w:r>
+        <w:rPr>
+          <w:rFonts w:ascii="Times New Roman" w:hAnsi="Times New Roman" w:cs="Times New Roman"/>
+          <w:sz w:val="24"/>
+          <w:szCs w:val="24"/>
+        </w:rPr>
+        <w:t>dalam</w:t>
+      </w:r>
+      <w:proofErr w:type="spellEnd"/>
+      <w:r>
+        <w:rPr>
+          <w:rFonts w:ascii="Times New Roman" w:hAnsi="Times New Roman" w:cs="Times New Roman"/>
+          <w:sz w:val="24"/>
+          <w:szCs w:val="24"/>
+        </w:rPr>
+        <w:t xml:space="preserve"> proses </w:t>
+      </w:r>
+      <w:proofErr w:type="spellStart"/>
+      <w:r>
+        <w:rPr>
+          <w:rFonts w:ascii="Times New Roman" w:hAnsi="Times New Roman" w:cs="Times New Roman"/>
+          <w:sz w:val="24"/>
+          <w:szCs w:val="24"/>
+        </w:rPr>
+        <w:t>pengelolan</w:t>
+      </w:r>
+      <w:proofErr w:type="spellEnd"/>
+      <w:r>
+        <w:rPr>
+          <w:rFonts w:ascii="Times New Roman" w:hAnsi="Times New Roman" w:cs="Times New Roman"/>
+          <w:sz w:val="24"/>
+          <w:szCs w:val="24"/>
+        </w:rPr>
+        <w:t xml:space="preserve"> </w:t>
+      </w:r>
+      <w:proofErr w:type="spellStart"/>
+      <w:r>
+        <w:rPr>
+          <w:rFonts w:ascii="Times New Roman" w:hAnsi="Times New Roman" w:cs="Times New Roman"/>
+          <w:sz w:val="24"/>
+          <w:szCs w:val="24"/>
+        </w:rPr>
+        <w:t>citra</w:t>
+      </w:r>
+      <w:proofErr w:type="spellEnd"/>
+    </w:p>
+    <w:p>
+      <w:pPr>
+        <w:pStyle w:val="ListParagraph"/>
+        <w:numPr>
+          <w:ilvl w:val="0"/>
+          <w:numId w:val="43"/>
+        </w:numPr>
+        <w:rPr>
+          <w:rFonts w:ascii="Times New Roman" w:hAnsi="Times New Roman" w:cs="Times New Roman"/>
+          <w:sz w:val="24"/>
+          <w:szCs w:val="24"/>
+        </w:rPr>
+      </w:pPr>
+      <w:proofErr w:type="spellStart"/>
+      <w:r>
+        <w:rPr>
+          <w:rFonts w:ascii="Times New Roman" w:hAnsi="Times New Roman" w:cs="Times New Roman"/>
+          <w:sz w:val="24"/>
+          <w:szCs w:val="24"/>
+        </w:rPr>
+        <w:t>Melakukan</w:t>
+      </w:r>
+      <w:proofErr w:type="spellEnd"/>
+      <w:r>
+        <w:rPr>
+          <w:rFonts w:ascii="Times New Roman" w:hAnsi="Times New Roman" w:cs="Times New Roman"/>
+          <w:sz w:val="24"/>
+          <w:szCs w:val="24"/>
+        </w:rPr>
+        <w:t xml:space="preserve"> </w:t>
+      </w:r>
+      <w:proofErr w:type="spellStart"/>
+      <w:r>
+        <w:rPr>
+          <w:rFonts w:ascii="Times New Roman" w:hAnsi="Times New Roman" w:cs="Times New Roman"/>
+          <w:sz w:val="24"/>
+          <w:szCs w:val="24"/>
+        </w:rPr>
+        <w:t>konversi</w:t>
+      </w:r>
+      <w:proofErr w:type="spellEnd"/>
+      <w:r>
+        <w:rPr>
+          <w:rFonts w:ascii="Times New Roman" w:hAnsi="Times New Roman" w:cs="Times New Roman"/>
+          <w:sz w:val="24"/>
+          <w:szCs w:val="24"/>
+        </w:rPr>
+        <w:t xml:space="preserve"> </w:t>
+      </w:r>
+      <w:proofErr w:type="spellStart"/>
+      <w:r>
+        <w:rPr>
+          <w:rFonts w:ascii="Times New Roman" w:hAnsi="Times New Roman" w:cs="Times New Roman"/>
+          <w:sz w:val="24"/>
+          <w:szCs w:val="24"/>
+        </w:rPr>
+        <w:t>citra</w:t>
+      </w:r>
+      <w:proofErr w:type="spellEnd"/>
+      <w:r>
+        <w:rPr>
+          <w:rFonts w:ascii="Times New Roman" w:hAnsi="Times New Roman" w:cs="Times New Roman"/>
+          <w:sz w:val="24"/>
+          <w:szCs w:val="24"/>
+        </w:rPr>
+        <w:t xml:space="preserve"> </w:t>
+      </w:r>
+      <w:proofErr w:type="spellStart"/>
+      <w:r>
+        <w:rPr>
+          <w:rFonts w:ascii="Times New Roman" w:hAnsi="Times New Roman" w:cs="Times New Roman"/>
+          <w:sz w:val="24"/>
+          <w:szCs w:val="24"/>
+        </w:rPr>
+        <w:t>dari</w:t>
+      </w:r>
+      <w:proofErr w:type="spellEnd"/>
+      <w:r>
+        <w:rPr>
+          <w:rFonts w:ascii="Times New Roman" w:hAnsi="Times New Roman" w:cs="Times New Roman"/>
+          <w:sz w:val="24"/>
+          <w:szCs w:val="24"/>
+        </w:rPr>
+        <w:t xml:space="preserve"> RGB </w:t>
+      </w:r>
+      <w:proofErr w:type="spellStart"/>
+      <w:r>
+        <w:rPr>
+          <w:rFonts w:ascii="Times New Roman" w:hAnsi="Times New Roman" w:cs="Times New Roman"/>
+          <w:sz w:val="24"/>
+          <w:szCs w:val="24"/>
+        </w:rPr>
+        <w:t>menjadi</w:t>
+      </w:r>
+      <w:proofErr w:type="spellEnd"/>
+      <w:r>
+        <w:rPr>
+          <w:rFonts w:ascii="Times New Roman" w:hAnsi="Times New Roman" w:cs="Times New Roman"/>
+          <w:sz w:val="24"/>
+          <w:szCs w:val="24"/>
+        </w:rPr>
+        <w:t xml:space="preserve"> Grayscale </w:t>
+      </w:r>
+      <w:proofErr w:type="spellStart"/>
+      <w:r>
+        <w:rPr>
+          <w:rFonts w:ascii="Times New Roman" w:hAnsi="Times New Roman" w:cs="Times New Roman"/>
+          <w:sz w:val="24"/>
+          <w:szCs w:val="24"/>
+        </w:rPr>
+        <w:t>untuk</w:t>
+      </w:r>
+      <w:proofErr w:type="spellEnd"/>
+      <w:r>
+        <w:rPr>
+          <w:rFonts w:ascii="Times New Roman" w:hAnsi="Times New Roman" w:cs="Times New Roman"/>
+          <w:sz w:val="24"/>
+          <w:szCs w:val="24"/>
+        </w:rPr>
+        <w:t xml:space="preserve"> </w:t>
+      </w:r>
+      <w:proofErr w:type="spellStart"/>
+      <w:r>
+        <w:rPr>
+          <w:rFonts w:ascii="Times New Roman" w:hAnsi="Times New Roman" w:cs="Times New Roman"/>
+          <w:sz w:val="24"/>
+          <w:szCs w:val="24"/>
+        </w:rPr>
+        <w:t>menyederhanakan</w:t>
+      </w:r>
+      <w:proofErr w:type="spellEnd"/>
+      <w:r>
+        <w:rPr>
+          <w:rFonts w:ascii="Times New Roman" w:hAnsi="Times New Roman" w:cs="Times New Roman"/>
+          <w:sz w:val="24"/>
+          <w:szCs w:val="24"/>
+        </w:rPr>
+        <w:t xml:space="preserve"> </w:t>
+      </w:r>
+      <w:proofErr w:type="spellStart"/>
+      <w:r>
+        <w:rPr>
+          <w:rFonts w:ascii="Times New Roman" w:hAnsi="Times New Roman" w:cs="Times New Roman"/>
+          <w:sz w:val="24"/>
+          <w:szCs w:val="24"/>
+        </w:rPr>
+        <w:t>representasi</w:t>
+      </w:r>
+      <w:proofErr w:type="spellEnd"/>
+      <w:r>
+        <w:rPr>
+          <w:rFonts w:ascii="Times New Roman" w:hAnsi="Times New Roman" w:cs="Times New Roman"/>
+          <w:sz w:val="24"/>
+          <w:szCs w:val="24"/>
+        </w:rPr>
+        <w:t xml:space="preserve"> visual </w:t>
+      </w:r>
+      <w:proofErr w:type="spellStart"/>
+      <w:r>
+        <w:rPr>
+          <w:rFonts w:ascii="Times New Roman" w:hAnsi="Times New Roman" w:cs="Times New Roman"/>
+          <w:sz w:val="24"/>
+          <w:szCs w:val="24"/>
+        </w:rPr>
+        <w:t>objek</w:t>
+      </w:r>
+      <w:proofErr w:type="spellEnd"/>
+      <w:r>
+        <w:rPr>
+          <w:rFonts w:ascii="Times New Roman" w:hAnsi="Times New Roman" w:cs="Times New Roman"/>
+          <w:sz w:val="24"/>
+          <w:szCs w:val="24"/>
+        </w:rPr>
+        <w:t xml:space="preserve"> </w:t>
+      </w:r>
+      <w:proofErr w:type="spellStart"/>
+      <w:r>
+        <w:rPr>
+          <w:rFonts w:ascii="Times New Roman" w:hAnsi="Times New Roman" w:cs="Times New Roman"/>
+          <w:sz w:val="24"/>
+          <w:szCs w:val="24"/>
+        </w:rPr>
+        <w:t>sampah</w:t>
+      </w:r>
+      <w:proofErr w:type="spellEnd"/>
+      <w:r>
+        <w:rPr>
+          <w:rFonts w:ascii="Times New Roman" w:hAnsi="Times New Roman" w:cs="Times New Roman"/>
+          <w:sz w:val="24"/>
+          <w:szCs w:val="24"/>
+        </w:rPr>
+        <w:t xml:space="preserve"> </w:t>
+      </w:r>
+      <w:proofErr w:type="spellStart"/>
+      <w:r>
+        <w:rPr>
+          <w:rFonts w:ascii="Times New Roman" w:hAnsi="Times New Roman" w:cs="Times New Roman"/>
+          <w:sz w:val="24"/>
+          <w:szCs w:val="24"/>
+        </w:rPr>
+        <w:t>dalam</w:t>
+      </w:r>
+      <w:proofErr w:type="spellEnd"/>
+      <w:r>
+        <w:rPr>
+          <w:rFonts w:ascii="Times New Roman" w:hAnsi="Times New Roman" w:cs="Times New Roman"/>
+          <w:sz w:val="24"/>
+          <w:szCs w:val="24"/>
+        </w:rPr>
+        <w:t xml:space="preserve"> proses </w:t>
+      </w:r>
+      <w:proofErr w:type="spellStart"/>
+      <w:r>
+        <w:rPr>
+          <w:rFonts w:ascii="Times New Roman" w:hAnsi="Times New Roman" w:cs="Times New Roman"/>
+          <w:sz w:val="24"/>
+          <w:szCs w:val="24"/>
+        </w:rPr>
+        <w:t>pengelolahan</w:t>
+      </w:r>
+      <w:proofErr w:type="spellEnd"/>
+      <w:r>
+        <w:rPr>
+          <w:rFonts w:ascii="Times New Roman" w:hAnsi="Times New Roman" w:cs="Times New Roman"/>
+          <w:sz w:val="24"/>
+          <w:szCs w:val="24"/>
+        </w:rPr>
+        <w:t xml:space="preserve"> </w:t>
+      </w:r>
+      <w:proofErr w:type="spellStart"/>
+      <w:r>
+        <w:rPr>
+          <w:rFonts w:ascii="Times New Roman" w:hAnsi="Times New Roman" w:cs="Times New Roman"/>
+          <w:sz w:val="24"/>
+          <w:szCs w:val="24"/>
+        </w:rPr>
+        <w:t>selanjutnya</w:t>
+      </w:r>
+      <w:proofErr w:type="spellEnd"/>
+      <w:r>
+        <w:rPr>
+          <w:rFonts w:ascii="Times New Roman" w:hAnsi="Times New Roman" w:cs="Times New Roman"/>
+          <w:sz w:val="24"/>
+          <w:szCs w:val="24"/>
+        </w:rPr>
+        <w:t>.</w:t>
+      </w:r>
+    </w:p>
+    <w:p>
+      <w:pPr>
+        <w:pStyle w:val="ListParagraph"/>
+        <w:numPr>
+          <w:ilvl w:val="0"/>
+          <w:numId w:val="43"/>
+        </w:numPr>
+        <w:rPr>
+          <w:rFonts w:ascii="Times New Roman" w:hAnsi="Times New Roman" w:cs="Times New Roman"/>
+          <w:sz w:val="24"/>
+          <w:szCs w:val="24"/>
+        </w:rPr>
+      </w:pPr>
+      <w:proofErr w:type="spellStart"/>
+      <w:r>
+        <w:rPr>
+          <w:rFonts w:ascii="Times New Roman" w:hAnsi="Times New Roman" w:cs="Times New Roman"/>
+          <w:sz w:val="24"/>
+          <w:szCs w:val="24"/>
+        </w:rPr>
+        <w:t>Memvisualisasikan</w:t>
+      </w:r>
+      <w:proofErr w:type="spellEnd"/>
+      <w:r>
+        <w:rPr>
+          <w:rFonts w:ascii="Times New Roman" w:hAnsi="Times New Roman" w:cs="Times New Roman"/>
+          <w:sz w:val="24"/>
+          <w:szCs w:val="24"/>
+        </w:rPr>
+        <w:t xml:space="preserve"> </w:t>
+      </w:r>
+      <w:proofErr w:type="spellStart"/>
+      <w:r>
+        <w:rPr>
+          <w:rFonts w:ascii="Times New Roman" w:hAnsi="Times New Roman" w:cs="Times New Roman"/>
+          <w:sz w:val="24"/>
+          <w:szCs w:val="24"/>
+        </w:rPr>
+        <w:t>hasil</w:t>
+      </w:r>
+      <w:proofErr w:type="spellEnd"/>
+      <w:r>
+        <w:rPr>
+          <w:rFonts w:ascii="Times New Roman" w:hAnsi="Times New Roman" w:cs="Times New Roman"/>
+          <w:sz w:val="24"/>
+          <w:szCs w:val="24"/>
+        </w:rPr>
+        <w:t xml:space="preserve"> </w:t>
+      </w:r>
+      <w:proofErr w:type="spellStart"/>
+      <w:r>
+        <w:rPr>
+          <w:rFonts w:ascii="Times New Roman" w:hAnsi="Times New Roman" w:cs="Times New Roman"/>
+          <w:sz w:val="24"/>
+          <w:szCs w:val="24"/>
+        </w:rPr>
+        <w:t>pengelolahan</w:t>
+      </w:r>
+      <w:proofErr w:type="spellEnd"/>
+      <w:r>
+        <w:rPr>
+          <w:rFonts w:ascii="Times New Roman" w:hAnsi="Times New Roman" w:cs="Times New Roman"/>
+          <w:sz w:val="24"/>
+          <w:szCs w:val="24"/>
+        </w:rPr>
+        <w:t xml:space="preserve"> dan </w:t>
+      </w:r>
+      <w:proofErr w:type="spellStart"/>
+      <w:r>
+        <w:rPr>
+          <w:rFonts w:ascii="Times New Roman" w:hAnsi="Times New Roman" w:cs="Times New Roman"/>
+          <w:sz w:val="24"/>
+          <w:szCs w:val="24"/>
+        </w:rPr>
+        <w:t>deteksi</w:t>
+      </w:r>
+      <w:proofErr w:type="spellEnd"/>
+      <w:r>
+        <w:rPr>
+          <w:rFonts w:ascii="Times New Roman" w:hAnsi="Times New Roman" w:cs="Times New Roman"/>
+          <w:sz w:val="24"/>
+          <w:szCs w:val="24"/>
+        </w:rPr>
+        <w:t xml:space="preserve"> </w:t>
+      </w:r>
+      <w:proofErr w:type="spellStart"/>
+      <w:proofErr w:type="gramStart"/>
+      <w:r>
+        <w:rPr>
+          <w:rFonts w:ascii="Times New Roman" w:hAnsi="Times New Roman" w:cs="Times New Roman"/>
+          <w:sz w:val="24"/>
+          <w:szCs w:val="24"/>
+        </w:rPr>
+        <w:t>citra</w:t>
+      </w:r>
+      <w:proofErr w:type="spellEnd"/>
+      <w:r>
+        <w:rPr>
+          <w:rFonts w:ascii="Times New Roman" w:hAnsi="Times New Roman" w:cs="Times New Roman"/>
+          <w:sz w:val="24"/>
+          <w:szCs w:val="24"/>
+        </w:rPr>
+        <w:t xml:space="preserve">  </w:t>
+      </w:r>
+      <w:proofErr w:type="spellStart"/>
+      <w:r>
+        <w:rPr>
+          <w:rFonts w:ascii="Times New Roman" w:hAnsi="Times New Roman" w:cs="Times New Roman"/>
+          <w:sz w:val="24"/>
+          <w:szCs w:val="24"/>
+        </w:rPr>
+        <w:t>melalui</w:t>
+      </w:r>
+      <w:proofErr w:type="spellEnd"/>
+      <w:proofErr w:type="gramEnd"/>
+      <w:r>
+        <w:rPr>
+          <w:rFonts w:ascii="Times New Roman" w:hAnsi="Times New Roman" w:cs="Times New Roman"/>
+          <w:sz w:val="24"/>
+          <w:szCs w:val="24"/>
+        </w:rPr>
+        <w:t xml:space="preserve"> drawing, bounding box dan label </w:t>
+      </w:r>
+      <w:proofErr w:type="spellStart"/>
+      <w:r>
+        <w:rPr>
+          <w:rFonts w:ascii="Times New Roman" w:hAnsi="Times New Roman" w:cs="Times New Roman"/>
+          <w:sz w:val="24"/>
+          <w:szCs w:val="24"/>
+        </w:rPr>
+        <w:t>menggunakan</w:t>
+      </w:r>
+      <w:proofErr w:type="spellEnd"/>
+      <w:r>
+        <w:rPr>
+          <w:rFonts w:ascii="Times New Roman" w:hAnsi="Times New Roman" w:cs="Times New Roman"/>
+          <w:sz w:val="24"/>
+          <w:szCs w:val="24"/>
+        </w:rPr>
+        <w:t xml:space="preserve"> </w:t>
+      </w:r>
+      <w:proofErr w:type="spellStart"/>
+      <w:r>
+        <w:rPr>
+          <w:rFonts w:ascii="Times New Roman" w:hAnsi="Times New Roman" w:cs="Times New Roman"/>
+          <w:sz w:val="24"/>
+          <w:szCs w:val="24"/>
+        </w:rPr>
+        <w:t>opencv</w:t>
+      </w:r>
+      <w:proofErr w:type="spellEnd"/>
+      <w:r>
+        <w:rPr>
+          <w:rFonts w:ascii="Times New Roman" w:hAnsi="Times New Roman" w:cs="Times New Roman"/>
+          <w:sz w:val="24"/>
+          <w:szCs w:val="24"/>
+        </w:rPr>
+        <w:t>.</w:t>
+      </w:r>
+    </w:p>
+    <w:p>
+      <w:pPr>
+        <w:pStyle w:val="ListParagraph"/>
+        <w:numPr>
+          <w:ilvl w:val="0"/>
+          <w:numId w:val="43"/>
+        </w:numPr>
+        <w:rPr>
+          <w:rFonts w:ascii="Times New Roman" w:hAnsi="Times New Roman" w:cs="Times New Roman"/>
+          <w:sz w:val="24"/>
+          <w:szCs w:val="24"/>
+        </w:rPr>
+      </w:pPr>
+      <w:proofErr w:type="spellStart"/>
+      <w:r>
+        <w:rPr>
+          <w:rFonts w:ascii="Times New Roman" w:hAnsi="Times New Roman" w:cs="Times New Roman"/>
+          <w:sz w:val="24"/>
+          <w:szCs w:val="24"/>
+        </w:rPr>
+        <w:t>Melakukan</w:t>
+      </w:r>
+      <w:proofErr w:type="spellEnd"/>
+      <w:r>
+        <w:rPr>
+          <w:rFonts w:ascii="Times New Roman" w:hAnsi="Times New Roman" w:cs="Times New Roman"/>
+          <w:sz w:val="24"/>
+          <w:szCs w:val="24"/>
+        </w:rPr>
+        <w:t xml:space="preserve"> </w:t>
+      </w:r>
+      <w:proofErr w:type="spellStart"/>
+      <w:r>
+        <w:rPr>
+          <w:rFonts w:ascii="Times New Roman" w:hAnsi="Times New Roman" w:cs="Times New Roman"/>
+          <w:sz w:val="24"/>
+          <w:szCs w:val="24"/>
+        </w:rPr>
+        <w:t>segmentasi</w:t>
+      </w:r>
+      <w:proofErr w:type="spellEnd"/>
+      <w:r>
+        <w:rPr>
+          <w:rFonts w:ascii="Times New Roman" w:hAnsi="Times New Roman" w:cs="Times New Roman"/>
+          <w:sz w:val="24"/>
+          <w:szCs w:val="24"/>
+        </w:rPr>
+        <w:t xml:space="preserve"> </w:t>
+      </w:r>
+      <w:proofErr w:type="spellStart"/>
+      <w:r>
+        <w:rPr>
+          <w:rFonts w:ascii="Times New Roman" w:hAnsi="Times New Roman" w:cs="Times New Roman"/>
+          <w:sz w:val="24"/>
+          <w:szCs w:val="24"/>
+        </w:rPr>
+        <w:t>sederhana</w:t>
+      </w:r>
+      <w:proofErr w:type="spellEnd"/>
+      <w:r>
+        <w:rPr>
+          <w:rFonts w:ascii="Times New Roman" w:hAnsi="Times New Roman" w:cs="Times New Roman"/>
+          <w:sz w:val="24"/>
+          <w:szCs w:val="24"/>
+        </w:rPr>
+        <w:t xml:space="preserve"> </w:t>
+      </w:r>
+      <w:proofErr w:type="spellStart"/>
+      <w:r>
+        <w:rPr>
+          <w:rFonts w:ascii="Times New Roman" w:hAnsi="Times New Roman" w:cs="Times New Roman"/>
+          <w:sz w:val="24"/>
+          <w:szCs w:val="24"/>
+        </w:rPr>
+        <w:t>berbasis</w:t>
+      </w:r>
+      <w:proofErr w:type="spellEnd"/>
+      <w:r>
+        <w:rPr>
+          <w:rFonts w:ascii="Times New Roman" w:hAnsi="Times New Roman" w:cs="Times New Roman"/>
+          <w:sz w:val="24"/>
+          <w:szCs w:val="24"/>
+        </w:rPr>
+        <w:t xml:space="preserve"> thresholding </w:t>
+      </w:r>
+      <w:proofErr w:type="spellStart"/>
+      <w:r>
+        <w:rPr>
+          <w:rFonts w:ascii="Times New Roman" w:hAnsi="Times New Roman" w:cs="Times New Roman"/>
+          <w:sz w:val="24"/>
+          <w:szCs w:val="24"/>
+        </w:rPr>
+        <w:t>untuk</w:t>
+      </w:r>
+      <w:proofErr w:type="spellEnd"/>
+      <w:r>
+        <w:rPr>
+          <w:rFonts w:ascii="Times New Roman" w:hAnsi="Times New Roman" w:cs="Times New Roman"/>
+          <w:sz w:val="24"/>
+          <w:szCs w:val="24"/>
+        </w:rPr>
+        <w:t xml:space="preserve"> </w:t>
+      </w:r>
+      <w:proofErr w:type="spellStart"/>
+      <w:r>
+        <w:rPr>
+          <w:rFonts w:ascii="Times New Roman" w:hAnsi="Times New Roman" w:cs="Times New Roman"/>
+          <w:sz w:val="24"/>
+          <w:szCs w:val="24"/>
+        </w:rPr>
+        <w:t>memisahkan</w:t>
+      </w:r>
+      <w:proofErr w:type="spellEnd"/>
+      <w:r>
+        <w:rPr>
+          <w:rFonts w:ascii="Times New Roman" w:hAnsi="Times New Roman" w:cs="Times New Roman"/>
+          <w:sz w:val="24"/>
+          <w:szCs w:val="24"/>
+        </w:rPr>
+        <w:t xml:space="preserve"> </w:t>
+      </w:r>
+      <w:proofErr w:type="spellStart"/>
+      <w:r>
+        <w:rPr>
+          <w:rFonts w:ascii="Times New Roman" w:hAnsi="Times New Roman" w:cs="Times New Roman"/>
+          <w:sz w:val="24"/>
+          <w:szCs w:val="24"/>
+        </w:rPr>
+        <w:t>objek</w:t>
+      </w:r>
+      <w:proofErr w:type="spellEnd"/>
+      <w:r>
+        <w:rPr>
+          <w:rFonts w:ascii="Times New Roman" w:hAnsi="Times New Roman" w:cs="Times New Roman"/>
+          <w:sz w:val="24"/>
+          <w:szCs w:val="24"/>
+        </w:rPr>
+        <w:t xml:space="preserve"> </w:t>
+      </w:r>
+      <w:proofErr w:type="spellStart"/>
+      <w:r>
+        <w:rPr>
+          <w:rFonts w:ascii="Times New Roman" w:hAnsi="Times New Roman" w:cs="Times New Roman"/>
+          <w:sz w:val="24"/>
+          <w:szCs w:val="24"/>
+        </w:rPr>
+        <w:t>dengan</w:t>
+      </w:r>
+      <w:proofErr w:type="spellEnd"/>
+      <w:r>
+        <w:rPr>
+          <w:rFonts w:ascii="Times New Roman" w:hAnsi="Times New Roman" w:cs="Times New Roman"/>
+          <w:sz w:val="24"/>
+          <w:szCs w:val="24"/>
+        </w:rPr>
+        <w:t xml:space="preserve"> </w:t>
+      </w:r>
+      <w:proofErr w:type="spellStart"/>
+      <w:r>
+        <w:rPr>
+          <w:rFonts w:ascii="Times New Roman" w:hAnsi="Times New Roman" w:cs="Times New Roman"/>
+          <w:sz w:val="24"/>
+          <w:szCs w:val="24"/>
+        </w:rPr>
+        <w:t>latar</w:t>
+      </w:r>
+      <w:proofErr w:type="spellEnd"/>
+      <w:r>
+        <w:rPr>
+          <w:rFonts w:ascii="Times New Roman" w:hAnsi="Times New Roman" w:cs="Times New Roman"/>
+          <w:sz w:val="24"/>
+          <w:szCs w:val="24"/>
+        </w:rPr>
+        <w:t xml:space="preserve"> </w:t>
+      </w:r>
+      <w:proofErr w:type="spellStart"/>
+      <w:r>
+        <w:rPr>
+          <w:rFonts w:ascii="Times New Roman" w:hAnsi="Times New Roman" w:cs="Times New Roman"/>
+          <w:sz w:val="24"/>
+          <w:szCs w:val="24"/>
+        </w:rPr>
+        <w:t>belakang</w:t>
+      </w:r>
+      <w:proofErr w:type="spellEnd"/>
+      <w:r>
+        <w:rPr>
+          <w:rFonts w:ascii="Times New Roman" w:hAnsi="Times New Roman" w:cs="Times New Roman"/>
+          <w:sz w:val="24"/>
+          <w:szCs w:val="24"/>
+        </w:rPr>
+        <w:t xml:space="preserve"> </w:t>
+      </w:r>
+      <w:proofErr w:type="spellStart"/>
+      <w:r>
+        <w:rPr>
+          <w:rFonts w:ascii="Times New Roman" w:hAnsi="Times New Roman" w:cs="Times New Roman"/>
+          <w:sz w:val="24"/>
+          <w:szCs w:val="24"/>
+        </w:rPr>
+        <w:t>citra</w:t>
+      </w:r>
+      <w:proofErr w:type="spellEnd"/>
+      <w:r>
+        <w:rPr>
+          <w:rFonts w:ascii="Times New Roman" w:hAnsi="Times New Roman" w:cs="Times New Roman"/>
+          <w:sz w:val="24"/>
+          <w:szCs w:val="24"/>
+        </w:rPr>
+        <w:t xml:space="preserve"> </w:t>
+      </w:r>
+      <w:proofErr w:type="spellStart"/>
+      <w:r>
+        <w:rPr>
+          <w:rFonts w:ascii="Times New Roman" w:hAnsi="Times New Roman" w:cs="Times New Roman"/>
+          <w:sz w:val="24"/>
+          <w:szCs w:val="24"/>
+        </w:rPr>
+        <w:t>secara</w:t>
+      </w:r>
+      <w:proofErr w:type="spellEnd"/>
+      <w:r>
+        <w:rPr>
+          <w:rFonts w:ascii="Times New Roman" w:hAnsi="Times New Roman" w:cs="Times New Roman"/>
+          <w:sz w:val="24"/>
+          <w:szCs w:val="24"/>
+        </w:rPr>
+        <w:t xml:space="preserve"> </w:t>
+      </w:r>
+      <w:proofErr w:type="spellStart"/>
+      <w:r>
+        <w:rPr>
+          <w:rFonts w:ascii="Times New Roman" w:hAnsi="Times New Roman" w:cs="Times New Roman"/>
+          <w:sz w:val="24"/>
+          <w:szCs w:val="24"/>
+        </w:rPr>
+        <w:t>otomatis</w:t>
+      </w:r>
+      <w:proofErr w:type="spellEnd"/>
+    </w:p>
+    <w:p>
+      <w:pPr>
+        <w:pStyle w:val="ListParagraph"/>
+        <w:numPr>
+          <w:ilvl w:val="0"/>
+          <w:numId w:val="43"/>
+        </w:numPr>
+        <w:rPr>
+          <w:rFonts w:ascii="Times New Roman" w:hAnsi="Times New Roman" w:cs="Times New Roman"/>
+          <w:sz w:val="24"/>
+          <w:szCs w:val="24"/>
+        </w:rPr>
+      </w:pPr>
+      <w:proofErr w:type="spellStart"/>
+      <w:r>
+        <w:rPr>
+          <w:rFonts w:ascii="Times New Roman" w:hAnsi="Times New Roman" w:cs="Times New Roman"/>
+          <w:sz w:val="24"/>
+          <w:szCs w:val="24"/>
+        </w:rPr>
+        <w:t>Menganalisis</w:t>
+      </w:r>
+      <w:proofErr w:type="spellEnd"/>
+      <w:r>
+        <w:rPr>
+          <w:rFonts w:ascii="Times New Roman" w:hAnsi="Times New Roman" w:cs="Times New Roman"/>
+          <w:sz w:val="24"/>
+          <w:szCs w:val="24"/>
+        </w:rPr>
+        <w:t xml:space="preserve"> </w:t>
+      </w:r>
+      <w:proofErr w:type="spellStart"/>
+      <w:r>
+        <w:rPr>
+          <w:rFonts w:ascii="Times New Roman" w:hAnsi="Times New Roman" w:cs="Times New Roman"/>
+          <w:sz w:val="24"/>
+          <w:szCs w:val="24"/>
+        </w:rPr>
+        <w:t>distribusi</w:t>
+      </w:r>
+      <w:proofErr w:type="spellEnd"/>
+      <w:r>
+        <w:rPr>
+          <w:rFonts w:ascii="Times New Roman" w:hAnsi="Times New Roman" w:cs="Times New Roman"/>
+          <w:sz w:val="24"/>
+          <w:szCs w:val="24"/>
+        </w:rPr>
+        <w:t xml:space="preserve"> pixel pada </w:t>
+      </w:r>
+      <w:proofErr w:type="spellStart"/>
+      <w:r>
+        <w:rPr>
+          <w:rFonts w:ascii="Times New Roman" w:hAnsi="Times New Roman" w:cs="Times New Roman"/>
+          <w:sz w:val="24"/>
+          <w:szCs w:val="24"/>
+        </w:rPr>
+        <w:t>citra</w:t>
+      </w:r>
+      <w:proofErr w:type="spellEnd"/>
+      <w:r>
+        <w:rPr>
+          <w:rFonts w:ascii="Times New Roman" w:hAnsi="Times New Roman" w:cs="Times New Roman"/>
+          <w:sz w:val="24"/>
+          <w:szCs w:val="24"/>
+        </w:rPr>
+        <w:t xml:space="preserve"> </w:t>
+      </w:r>
+      <w:proofErr w:type="spellStart"/>
+      <w:r>
+        <w:rPr>
+          <w:rFonts w:ascii="Times New Roman" w:hAnsi="Times New Roman" w:cs="Times New Roman"/>
+          <w:sz w:val="24"/>
+          <w:szCs w:val="24"/>
+        </w:rPr>
+        <w:t>sampah</w:t>
+      </w:r>
+      <w:proofErr w:type="spellEnd"/>
+      <w:r>
+        <w:rPr>
+          <w:rFonts w:ascii="Times New Roman" w:hAnsi="Times New Roman" w:cs="Times New Roman"/>
+          <w:sz w:val="24"/>
+          <w:szCs w:val="24"/>
+        </w:rPr>
+        <w:t xml:space="preserve"> </w:t>
+      </w:r>
+      <w:proofErr w:type="spellStart"/>
+      <w:r>
+        <w:rPr>
+          <w:rFonts w:ascii="Times New Roman" w:hAnsi="Times New Roman" w:cs="Times New Roman"/>
+          <w:sz w:val="24"/>
+          <w:szCs w:val="24"/>
+        </w:rPr>
+        <w:t>melalui</w:t>
+      </w:r>
+      <w:proofErr w:type="spellEnd"/>
+      <w:r>
+        <w:rPr>
+          <w:rFonts w:ascii="Times New Roman" w:hAnsi="Times New Roman" w:cs="Times New Roman"/>
+          <w:sz w:val="24"/>
+          <w:szCs w:val="24"/>
+        </w:rPr>
+        <w:t xml:space="preserve"> </w:t>
+      </w:r>
+      <w:r>
+        <w:rPr>
+          <w:rFonts w:ascii="Times New Roman" w:hAnsi="Times New Roman" w:cs="Times New Roman"/>
+          <w:sz w:val="24"/>
+          <w:szCs w:val="24"/>
+        </w:rPr>
+        <w:t xml:space="preserve">histogram </w:t>
+      </w:r>
+      <w:proofErr w:type="spellStart"/>
+      <w:r>
+        <w:rPr>
+          <w:rFonts w:ascii="Times New Roman" w:hAnsi="Times New Roman" w:cs="Times New Roman"/>
+          <w:sz w:val="24"/>
+          <w:szCs w:val="24"/>
+        </w:rPr>
+        <w:t>guna</w:t>
+      </w:r>
+      <w:proofErr w:type="spellEnd"/>
+      <w:r>
+        <w:rPr>
+          <w:rFonts w:ascii="Times New Roman" w:hAnsi="Times New Roman" w:cs="Times New Roman"/>
+          <w:sz w:val="24"/>
+          <w:szCs w:val="24"/>
+        </w:rPr>
+        <w:t xml:space="preserve"> </w:t>
+      </w:r>
+      <w:proofErr w:type="spellStart"/>
+      <w:r>
+        <w:rPr>
+          <w:rFonts w:ascii="Times New Roman" w:hAnsi="Times New Roman" w:cs="Times New Roman"/>
+          <w:sz w:val="24"/>
+          <w:szCs w:val="24"/>
+        </w:rPr>
+        <w:t>memahami</w:t>
+      </w:r>
+      <w:proofErr w:type="spellEnd"/>
+      <w:r>
+        <w:rPr>
+          <w:rFonts w:ascii="Times New Roman" w:hAnsi="Times New Roman" w:cs="Times New Roman"/>
+          <w:sz w:val="24"/>
+          <w:szCs w:val="24"/>
+        </w:rPr>
+        <w:t xml:space="preserve"> </w:t>
+      </w:r>
+      <w:proofErr w:type="spellStart"/>
+      <w:r>
+        <w:rPr>
+          <w:rFonts w:ascii="Times New Roman" w:hAnsi="Times New Roman" w:cs="Times New Roman"/>
+          <w:sz w:val="24"/>
+          <w:szCs w:val="24"/>
+        </w:rPr>
+        <w:t>karakteristik</w:t>
+      </w:r>
+      <w:proofErr w:type="spellEnd"/>
+      <w:r>
+        <w:rPr>
+          <w:rFonts w:ascii="Times New Roman" w:hAnsi="Times New Roman" w:cs="Times New Roman"/>
+          <w:sz w:val="24"/>
+          <w:szCs w:val="24"/>
+        </w:rPr>
+        <w:t xml:space="preserve"> dataset.</w:t>
+      </w:r>
+    </w:p>
+    <w:p>
+      <w:pPr>
+        <w:pStyle w:val="ListParagraph"/>
+        <w:ind w:left="1500"/>
+        <w:rPr>
+          <w:rFonts w:ascii="Times New Roman" w:hAnsi="Times New Roman" w:cs="Times New Roman"/>
+          <w:sz w:val="24"/>
+          <w:szCs w:val="24"/>
+        </w:rPr>
+      </w:pPr>
     </w:p>
     <w:p>
       <w:pPr>
@@ -5916,7 +6947,7 @@
           <w:szCs w:val="28"/>
         </w:rPr>
       </w:pPr>
-      <w:bookmarkStart w:id="6" w:name="_Toc227788662"/>
+      <w:bookmarkStart w:id="5" w:name="_Toc227788662"/>
       <w:proofErr w:type="spellStart"/>
       <w:r>
         <w:rPr>
@@ -5929,8 +6960,1205 @@
         </w:rPr>
         <w:t>Manfaat</w:t>
       </w:r>
+      <w:bookmarkEnd w:id="5"/>
+      <w:proofErr w:type="spellEnd"/>
+    </w:p>
+    <w:p>
+      <w:pPr>
+        <w:ind w:left="780"/>
+        <w:rPr>
+          <w:rFonts w:ascii="Times New Roman" w:hAnsi="Times New Roman" w:cs="Times New Roman"/>
+          <w:sz w:val="24"/>
+          <w:szCs w:val="24"/>
+        </w:rPr>
+      </w:pPr>
+      <w:proofErr w:type="spellStart"/>
+      <w:r>
+        <w:rPr>
+          <w:rFonts w:ascii="Times New Roman" w:hAnsi="Times New Roman" w:cs="Times New Roman"/>
+          <w:sz w:val="24"/>
+          <w:szCs w:val="24"/>
+        </w:rPr>
+        <w:t>Manfaat</w:t>
+      </w:r>
+      <w:proofErr w:type="spellEnd"/>
+      <w:r>
+        <w:rPr>
+          <w:rFonts w:ascii="Times New Roman" w:hAnsi="Times New Roman" w:cs="Times New Roman"/>
+          <w:sz w:val="24"/>
+          <w:szCs w:val="24"/>
+        </w:rPr>
+        <w:t xml:space="preserve"> yang </w:t>
+      </w:r>
+      <w:proofErr w:type="spellStart"/>
+      <w:r>
+        <w:rPr>
+          <w:rFonts w:ascii="Times New Roman" w:hAnsi="Times New Roman" w:cs="Times New Roman"/>
+          <w:sz w:val="24"/>
+          <w:szCs w:val="24"/>
+        </w:rPr>
+        <w:t>saya</w:t>
+      </w:r>
+      <w:proofErr w:type="spellEnd"/>
+      <w:r>
+        <w:rPr>
+          <w:rFonts w:ascii="Times New Roman" w:hAnsi="Times New Roman" w:cs="Times New Roman"/>
+          <w:sz w:val="24"/>
+          <w:szCs w:val="24"/>
+        </w:rPr>
+        <w:t xml:space="preserve"> </w:t>
+      </w:r>
+      <w:proofErr w:type="spellStart"/>
+      <w:r>
+        <w:rPr>
+          <w:rFonts w:ascii="Times New Roman" w:hAnsi="Times New Roman" w:cs="Times New Roman"/>
+          <w:sz w:val="24"/>
+          <w:szCs w:val="24"/>
+        </w:rPr>
+        <w:t>dapatkan</w:t>
+      </w:r>
+      <w:proofErr w:type="spellEnd"/>
+      <w:r>
+        <w:rPr>
+          <w:rFonts w:ascii="Times New Roman" w:hAnsi="Times New Roman" w:cs="Times New Roman"/>
+          <w:sz w:val="24"/>
+          <w:szCs w:val="24"/>
+        </w:rPr>
+        <w:t xml:space="preserve"> </w:t>
+      </w:r>
+      <w:proofErr w:type="spellStart"/>
+      <w:r>
+        <w:rPr>
+          <w:rFonts w:ascii="Times New Roman" w:hAnsi="Times New Roman" w:cs="Times New Roman"/>
+          <w:sz w:val="24"/>
+          <w:szCs w:val="24"/>
+        </w:rPr>
+        <w:t>dalam</w:t>
+      </w:r>
+      <w:proofErr w:type="spellEnd"/>
+      <w:r>
+        <w:rPr>
+          <w:rFonts w:ascii="Times New Roman" w:hAnsi="Times New Roman" w:cs="Times New Roman"/>
+          <w:sz w:val="24"/>
+          <w:szCs w:val="24"/>
+        </w:rPr>
+        <w:t xml:space="preserve"> proses </w:t>
+      </w:r>
+      <w:proofErr w:type="spellStart"/>
+      <w:r>
+        <w:rPr>
+          <w:rFonts w:ascii="Times New Roman" w:hAnsi="Times New Roman" w:cs="Times New Roman"/>
+          <w:sz w:val="24"/>
+          <w:szCs w:val="24"/>
+        </w:rPr>
+        <w:t>pengelolahan</w:t>
+      </w:r>
+      <w:proofErr w:type="spellEnd"/>
+      <w:r>
+        <w:rPr>
+          <w:rFonts w:ascii="Times New Roman" w:hAnsi="Times New Roman" w:cs="Times New Roman"/>
+          <w:sz w:val="24"/>
+          <w:szCs w:val="24"/>
+        </w:rPr>
+        <w:t xml:space="preserve"> dan </w:t>
+      </w:r>
+      <w:proofErr w:type="spellStart"/>
+      <w:r>
+        <w:rPr>
+          <w:rFonts w:ascii="Times New Roman" w:hAnsi="Times New Roman" w:cs="Times New Roman"/>
+          <w:sz w:val="24"/>
+          <w:szCs w:val="24"/>
+        </w:rPr>
+        <w:t>deteksi</w:t>
+      </w:r>
+      <w:proofErr w:type="spellEnd"/>
+      <w:r>
+        <w:rPr>
+          <w:rFonts w:ascii="Times New Roman" w:hAnsi="Times New Roman" w:cs="Times New Roman"/>
+          <w:sz w:val="24"/>
+          <w:szCs w:val="24"/>
+        </w:rPr>
+        <w:t xml:space="preserve"> </w:t>
+      </w:r>
+      <w:proofErr w:type="spellStart"/>
+      <w:r>
+        <w:rPr>
+          <w:rFonts w:ascii="Times New Roman" w:hAnsi="Times New Roman" w:cs="Times New Roman"/>
+          <w:sz w:val="24"/>
+          <w:szCs w:val="24"/>
+        </w:rPr>
+        <w:t>sampah</w:t>
+      </w:r>
+      <w:proofErr w:type="spellEnd"/>
+      <w:r>
+        <w:rPr>
+          <w:rFonts w:ascii="Times New Roman" w:hAnsi="Times New Roman" w:cs="Times New Roman"/>
+          <w:sz w:val="24"/>
+          <w:szCs w:val="24"/>
+        </w:rPr>
+        <w:t xml:space="preserve"> </w:t>
+      </w:r>
+      <w:proofErr w:type="spellStart"/>
+      <w:r>
+        <w:rPr>
+          <w:rFonts w:ascii="Times New Roman" w:hAnsi="Times New Roman" w:cs="Times New Roman"/>
+          <w:sz w:val="24"/>
+          <w:szCs w:val="24"/>
+        </w:rPr>
+        <w:t>berbasis</w:t>
+      </w:r>
+      <w:proofErr w:type="spellEnd"/>
+      <w:r>
+        <w:rPr>
+          <w:rFonts w:ascii="Times New Roman" w:hAnsi="Times New Roman" w:cs="Times New Roman"/>
+          <w:sz w:val="24"/>
+          <w:szCs w:val="24"/>
+        </w:rPr>
+        <w:t xml:space="preserve"> Teknik </w:t>
+      </w:r>
+      <w:proofErr w:type="spellStart"/>
+      <w:r>
+        <w:rPr>
+          <w:rFonts w:ascii="Times New Roman" w:hAnsi="Times New Roman" w:cs="Times New Roman"/>
+          <w:sz w:val="24"/>
+          <w:szCs w:val="24"/>
+        </w:rPr>
+        <w:t>pengelolahan</w:t>
+      </w:r>
+      <w:proofErr w:type="spellEnd"/>
+      <w:r>
+        <w:rPr>
+          <w:rFonts w:ascii="Times New Roman" w:hAnsi="Times New Roman" w:cs="Times New Roman"/>
+          <w:sz w:val="24"/>
+          <w:szCs w:val="24"/>
+        </w:rPr>
+        <w:t xml:space="preserve"> </w:t>
+      </w:r>
+      <w:proofErr w:type="spellStart"/>
+      <w:r>
+        <w:rPr>
+          <w:rFonts w:ascii="Times New Roman" w:hAnsi="Times New Roman" w:cs="Times New Roman"/>
+          <w:sz w:val="24"/>
+          <w:szCs w:val="24"/>
+        </w:rPr>
+        <w:t>citra</w:t>
+      </w:r>
+      <w:proofErr w:type="spellEnd"/>
+      <w:r>
+        <w:rPr>
+          <w:rFonts w:ascii="Times New Roman" w:hAnsi="Times New Roman" w:cs="Times New Roman"/>
+          <w:sz w:val="24"/>
+          <w:szCs w:val="24"/>
+        </w:rPr>
+        <w:t xml:space="preserve"> </w:t>
+      </w:r>
+      <w:proofErr w:type="spellStart"/>
+      <w:r>
+        <w:rPr>
+          <w:rFonts w:ascii="Times New Roman" w:hAnsi="Times New Roman" w:cs="Times New Roman"/>
+          <w:sz w:val="24"/>
+          <w:szCs w:val="24"/>
+        </w:rPr>
+        <w:t>sebagai</w:t>
+      </w:r>
+      <w:proofErr w:type="spellEnd"/>
+      <w:r>
+        <w:rPr>
+          <w:rFonts w:ascii="Times New Roman" w:hAnsi="Times New Roman" w:cs="Times New Roman"/>
+          <w:sz w:val="24"/>
+          <w:szCs w:val="24"/>
+        </w:rPr>
+        <w:t xml:space="preserve"> </w:t>
+      </w:r>
+      <w:proofErr w:type="spellStart"/>
+      <w:r>
+        <w:rPr>
+          <w:rFonts w:ascii="Times New Roman" w:hAnsi="Times New Roman" w:cs="Times New Roman"/>
+          <w:sz w:val="24"/>
+          <w:szCs w:val="24"/>
+        </w:rPr>
+        <w:t>berikut</w:t>
+      </w:r>
+      <w:proofErr w:type="spellEnd"/>
+      <w:r>
+        <w:rPr>
+          <w:rFonts w:ascii="Times New Roman" w:hAnsi="Times New Roman" w:cs="Times New Roman"/>
+          <w:sz w:val="24"/>
+          <w:szCs w:val="24"/>
+        </w:rPr>
+        <w:t>:</w:t>
+      </w:r>
+    </w:p>
+    <w:p>
+      <w:pPr>
+        <w:pStyle w:val="ListParagraph"/>
+        <w:numPr>
+          <w:ilvl w:val="0"/>
+          <w:numId w:val="44"/>
+        </w:numPr>
+        <w:rPr>
+          <w:rFonts w:ascii="Times New Roman" w:hAnsi="Times New Roman" w:cs="Times New Roman"/>
+          <w:sz w:val="24"/>
+          <w:szCs w:val="24"/>
+        </w:rPr>
+      </w:pPr>
+      <w:proofErr w:type="spellStart"/>
+      <w:r>
+        <w:rPr>
+          <w:rFonts w:ascii="Times New Roman" w:hAnsi="Times New Roman" w:cs="Times New Roman"/>
+          <w:sz w:val="24"/>
+          <w:szCs w:val="24"/>
+        </w:rPr>
+        <w:t>Memberikan</w:t>
+      </w:r>
+      <w:proofErr w:type="spellEnd"/>
+      <w:r>
+        <w:rPr>
+          <w:rFonts w:ascii="Times New Roman" w:hAnsi="Times New Roman" w:cs="Times New Roman"/>
+          <w:sz w:val="24"/>
+          <w:szCs w:val="24"/>
+        </w:rPr>
+        <w:t xml:space="preserve"> </w:t>
+      </w:r>
+      <w:proofErr w:type="spellStart"/>
+      <w:r>
+        <w:rPr>
+          <w:rFonts w:ascii="Times New Roman" w:hAnsi="Times New Roman" w:cs="Times New Roman"/>
+          <w:sz w:val="24"/>
+          <w:szCs w:val="24"/>
+        </w:rPr>
+        <w:t>pemahaman</w:t>
+      </w:r>
+      <w:proofErr w:type="spellEnd"/>
+      <w:r>
+        <w:rPr>
+          <w:rFonts w:ascii="Times New Roman" w:hAnsi="Times New Roman" w:cs="Times New Roman"/>
+          <w:sz w:val="24"/>
+          <w:szCs w:val="24"/>
+        </w:rPr>
+        <w:t xml:space="preserve"> </w:t>
+      </w:r>
+      <w:proofErr w:type="spellStart"/>
+      <w:r>
+        <w:rPr>
+          <w:rFonts w:ascii="Times New Roman" w:hAnsi="Times New Roman" w:cs="Times New Roman"/>
+          <w:sz w:val="24"/>
+          <w:szCs w:val="24"/>
+        </w:rPr>
+        <w:t>mendalam</w:t>
+      </w:r>
+      <w:proofErr w:type="spellEnd"/>
+      <w:r>
+        <w:rPr>
+          <w:rFonts w:ascii="Times New Roman" w:hAnsi="Times New Roman" w:cs="Times New Roman"/>
+          <w:sz w:val="24"/>
+          <w:szCs w:val="24"/>
+        </w:rPr>
+        <w:t xml:space="preserve"> </w:t>
+      </w:r>
+      <w:proofErr w:type="spellStart"/>
+      <w:r>
+        <w:rPr>
+          <w:rFonts w:ascii="Times New Roman" w:hAnsi="Times New Roman" w:cs="Times New Roman"/>
+          <w:sz w:val="24"/>
+          <w:szCs w:val="24"/>
+        </w:rPr>
+        <w:t>mengenai</w:t>
+      </w:r>
+      <w:proofErr w:type="spellEnd"/>
+      <w:r>
+        <w:rPr>
+          <w:rFonts w:ascii="Times New Roman" w:hAnsi="Times New Roman" w:cs="Times New Roman"/>
+          <w:sz w:val="24"/>
+          <w:szCs w:val="24"/>
+        </w:rPr>
+        <w:t xml:space="preserve"> </w:t>
+      </w:r>
+      <w:proofErr w:type="spellStart"/>
+      <w:r>
+        <w:rPr>
+          <w:rFonts w:ascii="Times New Roman" w:hAnsi="Times New Roman" w:cs="Times New Roman"/>
+          <w:sz w:val="24"/>
+          <w:szCs w:val="24"/>
+        </w:rPr>
+        <w:t>konsep</w:t>
+      </w:r>
+      <w:proofErr w:type="spellEnd"/>
+      <w:r>
+        <w:rPr>
+          <w:rFonts w:ascii="Times New Roman" w:hAnsi="Times New Roman" w:cs="Times New Roman"/>
+          <w:sz w:val="24"/>
+          <w:szCs w:val="24"/>
+        </w:rPr>
+        <w:t xml:space="preserve"> dan </w:t>
+      </w:r>
+      <w:proofErr w:type="spellStart"/>
+      <w:r>
+        <w:rPr>
+          <w:rFonts w:ascii="Times New Roman" w:hAnsi="Times New Roman" w:cs="Times New Roman"/>
+          <w:sz w:val="24"/>
+          <w:szCs w:val="24"/>
+        </w:rPr>
+        <w:t>implementasi</w:t>
+      </w:r>
+      <w:proofErr w:type="spellEnd"/>
+      <w:r>
+        <w:rPr>
+          <w:rFonts w:ascii="Times New Roman" w:hAnsi="Times New Roman" w:cs="Times New Roman"/>
+          <w:sz w:val="24"/>
+          <w:szCs w:val="24"/>
+        </w:rPr>
+        <w:t xml:space="preserve"> Teknik </w:t>
+      </w:r>
+      <w:proofErr w:type="spellStart"/>
+      <w:r>
+        <w:rPr>
+          <w:rFonts w:ascii="Times New Roman" w:hAnsi="Times New Roman" w:cs="Times New Roman"/>
+          <w:sz w:val="24"/>
+          <w:szCs w:val="24"/>
+        </w:rPr>
+        <w:t>pengelolan</w:t>
+      </w:r>
+      <w:proofErr w:type="spellEnd"/>
+      <w:r>
+        <w:rPr>
+          <w:rFonts w:ascii="Times New Roman" w:hAnsi="Times New Roman" w:cs="Times New Roman"/>
+          <w:sz w:val="24"/>
+          <w:szCs w:val="24"/>
+        </w:rPr>
+        <w:t xml:space="preserve"> </w:t>
+      </w:r>
+      <w:proofErr w:type="spellStart"/>
+      <w:r>
+        <w:rPr>
+          <w:rFonts w:ascii="Times New Roman" w:hAnsi="Times New Roman" w:cs="Times New Roman"/>
+          <w:sz w:val="24"/>
+          <w:szCs w:val="24"/>
+        </w:rPr>
+        <w:t>citra</w:t>
+      </w:r>
+      <w:proofErr w:type="spellEnd"/>
+      <w:r>
+        <w:rPr>
+          <w:rFonts w:ascii="Times New Roman" w:hAnsi="Times New Roman" w:cs="Times New Roman"/>
+          <w:sz w:val="24"/>
+          <w:szCs w:val="24"/>
+        </w:rPr>
+        <w:t xml:space="preserve"> </w:t>
+      </w:r>
+      <w:proofErr w:type="spellStart"/>
+      <w:r>
+        <w:rPr>
+          <w:rFonts w:ascii="Times New Roman" w:hAnsi="Times New Roman" w:cs="Times New Roman"/>
+          <w:sz w:val="24"/>
+          <w:szCs w:val="24"/>
+        </w:rPr>
+        <w:t>mulai</w:t>
+      </w:r>
+      <w:proofErr w:type="spellEnd"/>
+      <w:r>
+        <w:rPr>
+          <w:rFonts w:ascii="Times New Roman" w:hAnsi="Times New Roman" w:cs="Times New Roman"/>
+          <w:sz w:val="24"/>
+          <w:szCs w:val="24"/>
+        </w:rPr>
+        <w:t xml:space="preserve"> </w:t>
+      </w:r>
+      <w:proofErr w:type="spellStart"/>
+      <w:r>
+        <w:rPr>
+          <w:rFonts w:ascii="Times New Roman" w:hAnsi="Times New Roman" w:cs="Times New Roman"/>
+          <w:sz w:val="24"/>
+          <w:szCs w:val="24"/>
+        </w:rPr>
+        <w:t>dari</w:t>
+      </w:r>
+      <w:proofErr w:type="spellEnd"/>
+      <w:r>
+        <w:rPr>
+          <w:rFonts w:ascii="Times New Roman" w:hAnsi="Times New Roman" w:cs="Times New Roman"/>
+          <w:sz w:val="24"/>
+          <w:szCs w:val="24"/>
+        </w:rPr>
+        <w:t xml:space="preserve"> </w:t>
+      </w:r>
+      <w:proofErr w:type="spellStart"/>
+      <w:r>
+        <w:rPr>
+          <w:rFonts w:ascii="Times New Roman" w:hAnsi="Times New Roman" w:cs="Times New Roman"/>
+          <w:sz w:val="24"/>
+          <w:szCs w:val="24"/>
+        </w:rPr>
+        <w:t>konversi</w:t>
+      </w:r>
+      <w:proofErr w:type="spellEnd"/>
+      <w:r>
+        <w:rPr>
+          <w:rFonts w:ascii="Times New Roman" w:hAnsi="Times New Roman" w:cs="Times New Roman"/>
+          <w:sz w:val="24"/>
+          <w:szCs w:val="24"/>
+        </w:rPr>
+        <w:t xml:space="preserve"> </w:t>
+      </w:r>
+      <w:proofErr w:type="spellStart"/>
+      <w:r>
+        <w:rPr>
+          <w:rFonts w:ascii="Times New Roman" w:hAnsi="Times New Roman" w:cs="Times New Roman"/>
+          <w:sz w:val="24"/>
+          <w:szCs w:val="24"/>
+        </w:rPr>
+        <w:t>warna</w:t>
+      </w:r>
+      <w:proofErr w:type="spellEnd"/>
+      <w:r>
+        <w:rPr>
+          <w:rFonts w:ascii="Times New Roman" w:hAnsi="Times New Roman" w:cs="Times New Roman"/>
+          <w:sz w:val="24"/>
+          <w:szCs w:val="24"/>
+        </w:rPr>
+        <w:t xml:space="preserve"> </w:t>
+      </w:r>
+      <w:proofErr w:type="spellStart"/>
+      <w:r>
+        <w:rPr>
+          <w:rFonts w:ascii="Times New Roman" w:hAnsi="Times New Roman" w:cs="Times New Roman"/>
+          <w:sz w:val="24"/>
+          <w:szCs w:val="24"/>
+        </w:rPr>
+        <w:t>analisis</w:t>
+      </w:r>
+      <w:proofErr w:type="spellEnd"/>
+      <w:r>
+        <w:rPr>
+          <w:rFonts w:ascii="Times New Roman" w:hAnsi="Times New Roman" w:cs="Times New Roman"/>
+          <w:sz w:val="24"/>
+          <w:szCs w:val="24"/>
+        </w:rPr>
+        <w:t xml:space="preserve"> </w:t>
+      </w:r>
+      <w:r>
+        <w:rPr>
+          <w:rFonts w:ascii="Times New Roman" w:hAnsi="Times New Roman" w:cs="Times New Roman"/>
+          <w:sz w:val="24"/>
+          <w:szCs w:val="24"/>
+        </w:rPr>
+        <w:t xml:space="preserve">histogram, </w:t>
+      </w:r>
+      <w:proofErr w:type="gramStart"/>
+      <w:r>
+        <w:rPr>
+          <w:rFonts w:ascii="Times New Roman" w:hAnsi="Times New Roman" w:cs="Times New Roman"/>
+          <w:sz w:val="24"/>
+          <w:szCs w:val="24"/>
+        </w:rPr>
+        <w:t>filtering ,</w:t>
+      </w:r>
+      <w:proofErr w:type="gramEnd"/>
+      <w:r>
+        <w:rPr>
+          <w:rFonts w:ascii="Times New Roman" w:hAnsi="Times New Roman" w:cs="Times New Roman"/>
+          <w:sz w:val="24"/>
+          <w:szCs w:val="24"/>
+        </w:rPr>
+        <w:t xml:space="preserve"> </w:t>
+      </w:r>
+      <w:proofErr w:type="spellStart"/>
+      <w:r>
+        <w:rPr>
+          <w:rFonts w:ascii="Times New Roman" w:hAnsi="Times New Roman" w:cs="Times New Roman"/>
+          <w:sz w:val="24"/>
+          <w:szCs w:val="24"/>
+        </w:rPr>
+        <w:t>segmentasi</w:t>
+      </w:r>
+      <w:proofErr w:type="spellEnd"/>
+      <w:r>
+        <w:rPr>
+          <w:rFonts w:ascii="Times New Roman" w:hAnsi="Times New Roman" w:cs="Times New Roman"/>
+          <w:sz w:val="24"/>
+          <w:szCs w:val="24"/>
+        </w:rPr>
+        <w:t xml:space="preserve"> , </w:t>
+      </w:r>
+      <w:proofErr w:type="spellStart"/>
+      <w:r>
+        <w:rPr>
+          <w:rFonts w:ascii="Times New Roman" w:hAnsi="Times New Roman" w:cs="Times New Roman"/>
+          <w:sz w:val="24"/>
+          <w:szCs w:val="24"/>
+        </w:rPr>
+        <w:t>hingga</w:t>
+      </w:r>
+      <w:proofErr w:type="spellEnd"/>
+      <w:r>
+        <w:rPr>
+          <w:rFonts w:ascii="Times New Roman" w:hAnsi="Times New Roman" w:cs="Times New Roman"/>
+          <w:sz w:val="24"/>
+          <w:szCs w:val="24"/>
+        </w:rPr>
+        <w:t xml:space="preserve"> </w:t>
+      </w:r>
+      <w:proofErr w:type="spellStart"/>
+      <w:r>
+        <w:rPr>
+          <w:rFonts w:ascii="Times New Roman" w:hAnsi="Times New Roman" w:cs="Times New Roman"/>
+          <w:sz w:val="24"/>
+          <w:szCs w:val="24"/>
+        </w:rPr>
+        <w:t>deteksi</w:t>
+      </w:r>
+      <w:proofErr w:type="spellEnd"/>
+      <w:r>
+        <w:rPr>
+          <w:rFonts w:ascii="Times New Roman" w:hAnsi="Times New Roman" w:cs="Times New Roman"/>
+          <w:sz w:val="24"/>
+          <w:szCs w:val="24"/>
+        </w:rPr>
+        <w:t xml:space="preserve"> pada </w:t>
+      </w:r>
+      <w:proofErr w:type="spellStart"/>
+      <w:r>
+        <w:rPr>
+          <w:rFonts w:ascii="Times New Roman" w:hAnsi="Times New Roman" w:cs="Times New Roman"/>
+          <w:sz w:val="24"/>
+          <w:szCs w:val="24"/>
+        </w:rPr>
+        <w:t>objek</w:t>
+      </w:r>
+      <w:proofErr w:type="spellEnd"/>
+      <w:r>
+        <w:rPr>
+          <w:rFonts w:ascii="Times New Roman" w:hAnsi="Times New Roman" w:cs="Times New Roman"/>
+          <w:sz w:val="24"/>
+          <w:szCs w:val="24"/>
+        </w:rPr>
+        <w:t xml:space="preserve"> </w:t>
+      </w:r>
+      <w:proofErr w:type="spellStart"/>
+      <w:r>
+        <w:rPr>
+          <w:rFonts w:ascii="Times New Roman" w:hAnsi="Times New Roman" w:cs="Times New Roman"/>
+          <w:sz w:val="24"/>
+          <w:szCs w:val="24"/>
+        </w:rPr>
+        <w:t>nyata</w:t>
+      </w:r>
+      <w:proofErr w:type="spellEnd"/>
+      <w:r>
+        <w:rPr>
+          <w:rFonts w:ascii="Times New Roman" w:hAnsi="Times New Roman" w:cs="Times New Roman"/>
+          <w:sz w:val="24"/>
+          <w:szCs w:val="24"/>
+        </w:rPr>
+        <w:t>.</w:t>
+      </w:r>
+    </w:p>
+    <w:p>
+      <w:pPr>
+        <w:pStyle w:val="ListParagraph"/>
+        <w:numPr>
+          <w:ilvl w:val="0"/>
+          <w:numId w:val="44"/>
+        </w:numPr>
+        <w:rPr>
+          <w:rFonts w:ascii="Times New Roman" w:hAnsi="Times New Roman" w:cs="Times New Roman"/>
+          <w:sz w:val="24"/>
+          <w:szCs w:val="24"/>
+        </w:rPr>
+      </w:pPr>
+      <w:proofErr w:type="spellStart"/>
+      <w:r>
+        <w:rPr>
+          <w:rFonts w:ascii="Times New Roman" w:hAnsi="Times New Roman" w:cs="Times New Roman"/>
+          <w:sz w:val="24"/>
+          <w:szCs w:val="24"/>
+        </w:rPr>
+        <w:t>Memperkaya</w:t>
+      </w:r>
+      <w:proofErr w:type="spellEnd"/>
+      <w:r>
+        <w:rPr>
+          <w:rFonts w:ascii="Times New Roman" w:hAnsi="Times New Roman" w:cs="Times New Roman"/>
+          <w:sz w:val="24"/>
+          <w:szCs w:val="24"/>
+        </w:rPr>
+        <w:t xml:space="preserve"> </w:t>
+      </w:r>
+      <w:proofErr w:type="spellStart"/>
+      <w:r>
+        <w:rPr>
+          <w:rFonts w:ascii="Times New Roman" w:hAnsi="Times New Roman" w:cs="Times New Roman"/>
+          <w:sz w:val="24"/>
+          <w:szCs w:val="24"/>
+        </w:rPr>
+        <w:t>wawasan</w:t>
+      </w:r>
+      <w:proofErr w:type="spellEnd"/>
+      <w:r>
+        <w:rPr>
+          <w:rFonts w:ascii="Times New Roman" w:hAnsi="Times New Roman" w:cs="Times New Roman"/>
+          <w:sz w:val="24"/>
+          <w:szCs w:val="24"/>
+        </w:rPr>
+        <w:t xml:space="preserve"> </w:t>
+      </w:r>
+      <w:proofErr w:type="spellStart"/>
+      <w:r>
+        <w:rPr>
+          <w:rFonts w:ascii="Times New Roman" w:hAnsi="Times New Roman" w:cs="Times New Roman"/>
+          <w:sz w:val="24"/>
+          <w:szCs w:val="24"/>
+        </w:rPr>
+        <w:t>tentang</w:t>
+      </w:r>
+      <w:proofErr w:type="spellEnd"/>
+      <w:r>
+        <w:rPr>
+          <w:rFonts w:ascii="Times New Roman" w:hAnsi="Times New Roman" w:cs="Times New Roman"/>
+          <w:sz w:val="24"/>
+          <w:szCs w:val="24"/>
+        </w:rPr>
+        <w:t xml:space="preserve"> </w:t>
+      </w:r>
+      <w:proofErr w:type="spellStart"/>
+      <w:r>
+        <w:rPr>
+          <w:rFonts w:ascii="Times New Roman" w:hAnsi="Times New Roman" w:cs="Times New Roman"/>
+          <w:sz w:val="24"/>
+          <w:szCs w:val="24"/>
+        </w:rPr>
+        <w:t>pemanfaatan</w:t>
+      </w:r>
+      <w:proofErr w:type="spellEnd"/>
+      <w:r>
+        <w:rPr>
+          <w:rFonts w:ascii="Times New Roman" w:hAnsi="Times New Roman" w:cs="Times New Roman"/>
+          <w:sz w:val="24"/>
+          <w:szCs w:val="24"/>
+        </w:rPr>
+        <w:t xml:space="preserve"> dataset </w:t>
+      </w:r>
+      <w:proofErr w:type="spellStart"/>
+      <w:r>
+        <w:rPr>
+          <w:rFonts w:ascii="Times New Roman" w:hAnsi="Times New Roman" w:cs="Times New Roman"/>
+          <w:sz w:val="24"/>
+          <w:szCs w:val="24"/>
+        </w:rPr>
+        <w:t>publik</w:t>
+      </w:r>
+      <w:proofErr w:type="spellEnd"/>
+      <w:r>
+        <w:rPr>
+          <w:rFonts w:ascii="Times New Roman" w:hAnsi="Times New Roman" w:cs="Times New Roman"/>
+          <w:sz w:val="24"/>
+          <w:szCs w:val="24"/>
+        </w:rPr>
+        <w:t xml:space="preserve"> </w:t>
+      </w:r>
+      <w:proofErr w:type="spellStart"/>
+      <w:r>
+        <w:rPr>
+          <w:rFonts w:ascii="Times New Roman" w:hAnsi="Times New Roman" w:cs="Times New Roman"/>
+          <w:sz w:val="24"/>
+          <w:szCs w:val="24"/>
+        </w:rPr>
+        <w:t>dalam</w:t>
+      </w:r>
+      <w:proofErr w:type="spellEnd"/>
+      <w:r>
+        <w:rPr>
+          <w:rFonts w:ascii="Times New Roman" w:hAnsi="Times New Roman" w:cs="Times New Roman"/>
+          <w:sz w:val="24"/>
+          <w:szCs w:val="24"/>
+        </w:rPr>
+        <w:t xml:space="preserve"> </w:t>
+      </w:r>
+      <w:proofErr w:type="spellStart"/>
+      <w:r>
+        <w:rPr>
+          <w:rFonts w:ascii="Times New Roman" w:hAnsi="Times New Roman" w:cs="Times New Roman"/>
+          <w:sz w:val="24"/>
+          <w:szCs w:val="24"/>
+        </w:rPr>
+        <w:t>eksperimen</w:t>
+      </w:r>
+      <w:proofErr w:type="spellEnd"/>
+      <w:r>
+        <w:rPr>
+          <w:rFonts w:ascii="Times New Roman" w:hAnsi="Times New Roman" w:cs="Times New Roman"/>
+          <w:sz w:val="24"/>
+          <w:szCs w:val="24"/>
+        </w:rPr>
+        <w:t xml:space="preserve"> </w:t>
+      </w:r>
+      <w:proofErr w:type="spellStart"/>
+      <w:r>
+        <w:rPr>
+          <w:rFonts w:ascii="Times New Roman" w:hAnsi="Times New Roman" w:cs="Times New Roman"/>
+          <w:sz w:val="24"/>
+          <w:szCs w:val="24"/>
+        </w:rPr>
+        <w:t>pengelolan</w:t>
+      </w:r>
+      <w:proofErr w:type="spellEnd"/>
+      <w:r>
+        <w:rPr>
+          <w:rFonts w:ascii="Times New Roman" w:hAnsi="Times New Roman" w:cs="Times New Roman"/>
+          <w:sz w:val="24"/>
+          <w:szCs w:val="24"/>
+        </w:rPr>
+        <w:t xml:space="preserve"> </w:t>
+      </w:r>
+      <w:proofErr w:type="spellStart"/>
+      <w:r>
+        <w:rPr>
+          <w:rFonts w:ascii="Times New Roman" w:hAnsi="Times New Roman" w:cs="Times New Roman"/>
+          <w:sz w:val="24"/>
+          <w:szCs w:val="24"/>
+        </w:rPr>
+        <w:t>citra</w:t>
+      </w:r>
+      <w:proofErr w:type="spellEnd"/>
+      <w:r>
+        <w:rPr>
+          <w:rFonts w:ascii="Times New Roman" w:hAnsi="Times New Roman" w:cs="Times New Roman"/>
+          <w:sz w:val="24"/>
+          <w:szCs w:val="24"/>
+        </w:rPr>
+        <w:t xml:space="preserve"> </w:t>
+      </w:r>
+      <w:proofErr w:type="spellStart"/>
+      <w:r>
+        <w:rPr>
+          <w:rFonts w:ascii="Times New Roman" w:hAnsi="Times New Roman" w:cs="Times New Roman"/>
+          <w:sz w:val="24"/>
+          <w:szCs w:val="24"/>
+        </w:rPr>
+        <w:t>berbasis</w:t>
+      </w:r>
+      <w:proofErr w:type="spellEnd"/>
+      <w:r>
+        <w:rPr>
+          <w:rFonts w:ascii="Times New Roman" w:hAnsi="Times New Roman" w:cs="Times New Roman"/>
+          <w:sz w:val="24"/>
+          <w:szCs w:val="24"/>
+        </w:rPr>
+        <w:t xml:space="preserve"> </w:t>
+      </w:r>
+      <w:proofErr w:type="spellStart"/>
+      <w:r>
+        <w:rPr>
+          <w:rFonts w:ascii="Times New Roman" w:hAnsi="Times New Roman" w:cs="Times New Roman"/>
+          <w:sz w:val="24"/>
+          <w:szCs w:val="24"/>
+        </w:rPr>
+        <w:t>opencv</w:t>
+      </w:r>
+      <w:proofErr w:type="spellEnd"/>
+    </w:p>
+    <w:p>
+      <w:pPr>
+        <w:pStyle w:val="ListParagraph"/>
+        <w:numPr>
+          <w:ilvl w:val="0"/>
+          <w:numId w:val="44"/>
+        </w:numPr>
+        <w:rPr>
+          <w:rFonts w:ascii="Times New Roman" w:hAnsi="Times New Roman" w:cs="Times New Roman"/>
+          <w:sz w:val="24"/>
+          <w:szCs w:val="24"/>
+        </w:rPr>
+      </w:pPr>
+      <w:proofErr w:type="spellStart"/>
+      <w:r>
+        <w:rPr>
+          <w:rFonts w:ascii="Times New Roman" w:hAnsi="Times New Roman" w:cs="Times New Roman"/>
+          <w:sz w:val="24"/>
+          <w:szCs w:val="24"/>
+        </w:rPr>
+        <w:t>Sistem</w:t>
+      </w:r>
+      <w:proofErr w:type="spellEnd"/>
+      <w:r>
+        <w:rPr>
+          <w:rFonts w:ascii="Times New Roman" w:hAnsi="Times New Roman" w:cs="Times New Roman"/>
+          <w:sz w:val="24"/>
+          <w:szCs w:val="24"/>
+        </w:rPr>
+        <w:t xml:space="preserve"> </w:t>
+      </w:r>
+      <w:proofErr w:type="spellStart"/>
+      <w:r>
+        <w:rPr>
+          <w:rFonts w:ascii="Times New Roman" w:hAnsi="Times New Roman" w:cs="Times New Roman"/>
+          <w:sz w:val="24"/>
+          <w:szCs w:val="24"/>
+        </w:rPr>
+        <w:t>Deteksi</w:t>
+      </w:r>
+      <w:proofErr w:type="spellEnd"/>
+      <w:r>
+        <w:rPr>
+          <w:rFonts w:ascii="Times New Roman" w:hAnsi="Times New Roman" w:cs="Times New Roman"/>
+          <w:sz w:val="24"/>
+          <w:szCs w:val="24"/>
+        </w:rPr>
+        <w:t xml:space="preserve"> dan </w:t>
+      </w:r>
+      <w:proofErr w:type="spellStart"/>
+      <w:r>
+        <w:rPr>
+          <w:rFonts w:ascii="Times New Roman" w:hAnsi="Times New Roman" w:cs="Times New Roman"/>
+          <w:sz w:val="24"/>
+          <w:szCs w:val="24"/>
+        </w:rPr>
+        <w:t>pemisahan</w:t>
+      </w:r>
+      <w:proofErr w:type="spellEnd"/>
+      <w:r>
+        <w:rPr>
+          <w:rFonts w:ascii="Times New Roman" w:hAnsi="Times New Roman" w:cs="Times New Roman"/>
+          <w:sz w:val="24"/>
+          <w:szCs w:val="24"/>
+        </w:rPr>
+        <w:t xml:space="preserve"> </w:t>
+      </w:r>
+      <w:proofErr w:type="spellStart"/>
+      <w:r>
+        <w:rPr>
+          <w:rFonts w:ascii="Times New Roman" w:hAnsi="Times New Roman" w:cs="Times New Roman"/>
+          <w:sz w:val="24"/>
+          <w:szCs w:val="24"/>
+        </w:rPr>
+        <w:t>sampah</w:t>
+      </w:r>
+      <w:proofErr w:type="spellEnd"/>
+      <w:r>
+        <w:rPr>
+          <w:rFonts w:ascii="Times New Roman" w:hAnsi="Times New Roman" w:cs="Times New Roman"/>
+          <w:sz w:val="24"/>
+          <w:szCs w:val="24"/>
+        </w:rPr>
+        <w:t xml:space="preserve"> </w:t>
+      </w:r>
+      <w:proofErr w:type="spellStart"/>
+      <w:r>
+        <w:rPr>
+          <w:rFonts w:ascii="Times New Roman" w:hAnsi="Times New Roman" w:cs="Times New Roman"/>
+          <w:sz w:val="24"/>
+          <w:szCs w:val="24"/>
+        </w:rPr>
+        <w:t>ini</w:t>
+      </w:r>
+      <w:proofErr w:type="spellEnd"/>
+      <w:r>
+        <w:rPr>
+          <w:rFonts w:ascii="Times New Roman" w:hAnsi="Times New Roman" w:cs="Times New Roman"/>
+          <w:sz w:val="24"/>
+          <w:szCs w:val="24"/>
+        </w:rPr>
+        <w:t xml:space="preserve"> </w:t>
+      </w:r>
+      <w:proofErr w:type="spellStart"/>
+      <w:r>
+        <w:rPr>
+          <w:rFonts w:ascii="Times New Roman" w:hAnsi="Times New Roman" w:cs="Times New Roman"/>
+          <w:sz w:val="24"/>
+          <w:szCs w:val="24"/>
+        </w:rPr>
+        <w:t>dapat</w:t>
+      </w:r>
+      <w:proofErr w:type="spellEnd"/>
+      <w:r>
+        <w:rPr>
+          <w:rFonts w:ascii="Times New Roman" w:hAnsi="Times New Roman" w:cs="Times New Roman"/>
+          <w:sz w:val="24"/>
+          <w:szCs w:val="24"/>
+        </w:rPr>
+        <w:t xml:space="preserve"> di </w:t>
+      </w:r>
+      <w:proofErr w:type="spellStart"/>
+      <w:r>
+        <w:rPr>
+          <w:rFonts w:ascii="Times New Roman" w:hAnsi="Times New Roman" w:cs="Times New Roman"/>
+          <w:sz w:val="24"/>
+          <w:szCs w:val="24"/>
+        </w:rPr>
+        <w:t>integrasikan</w:t>
+      </w:r>
+      <w:proofErr w:type="spellEnd"/>
+      <w:r>
+        <w:rPr>
+          <w:rFonts w:ascii="Times New Roman" w:hAnsi="Times New Roman" w:cs="Times New Roman"/>
+          <w:sz w:val="24"/>
+          <w:szCs w:val="24"/>
+        </w:rPr>
+        <w:t xml:space="preserve"> </w:t>
+      </w:r>
+      <w:proofErr w:type="spellStart"/>
+      <w:r>
+        <w:rPr>
+          <w:rFonts w:ascii="Times New Roman" w:hAnsi="Times New Roman" w:cs="Times New Roman"/>
+          <w:sz w:val="24"/>
+          <w:szCs w:val="24"/>
+        </w:rPr>
+        <w:t>ke</w:t>
+      </w:r>
+      <w:proofErr w:type="spellEnd"/>
+      <w:r>
+        <w:rPr>
+          <w:rFonts w:ascii="Times New Roman" w:hAnsi="Times New Roman" w:cs="Times New Roman"/>
+          <w:sz w:val="24"/>
+          <w:szCs w:val="24"/>
+        </w:rPr>
+        <w:t xml:space="preserve"> </w:t>
+      </w:r>
+      <w:proofErr w:type="spellStart"/>
+      <w:r>
+        <w:rPr>
+          <w:rFonts w:ascii="Times New Roman" w:hAnsi="Times New Roman" w:cs="Times New Roman"/>
+          <w:sz w:val="24"/>
+          <w:szCs w:val="24"/>
+        </w:rPr>
+        <w:t>dalam</w:t>
+      </w:r>
+      <w:proofErr w:type="spellEnd"/>
+      <w:r>
+        <w:rPr>
+          <w:rFonts w:ascii="Times New Roman" w:hAnsi="Times New Roman" w:cs="Times New Roman"/>
+          <w:sz w:val="24"/>
+          <w:szCs w:val="24"/>
+        </w:rPr>
+        <w:t xml:space="preserve"> </w:t>
+      </w:r>
+      <w:proofErr w:type="spellStart"/>
+      <w:r>
+        <w:rPr>
+          <w:rFonts w:ascii="Times New Roman" w:hAnsi="Times New Roman" w:cs="Times New Roman"/>
+          <w:sz w:val="24"/>
+          <w:szCs w:val="24"/>
+        </w:rPr>
+        <w:t>infrastruktur</w:t>
+      </w:r>
+      <w:proofErr w:type="spellEnd"/>
+      <w:r>
+        <w:rPr>
+          <w:rFonts w:ascii="Times New Roman" w:hAnsi="Times New Roman" w:cs="Times New Roman"/>
+          <w:sz w:val="24"/>
+          <w:szCs w:val="24"/>
+        </w:rPr>
+        <w:t xml:space="preserve"> </w:t>
+      </w:r>
+      <w:proofErr w:type="spellStart"/>
+      <w:r>
+        <w:rPr>
+          <w:rFonts w:ascii="Times New Roman" w:hAnsi="Times New Roman" w:cs="Times New Roman"/>
+          <w:sz w:val="24"/>
+          <w:szCs w:val="24"/>
+        </w:rPr>
+        <w:t>pengelolahan</w:t>
+      </w:r>
+      <w:proofErr w:type="spellEnd"/>
+      <w:r>
+        <w:rPr>
+          <w:rFonts w:ascii="Times New Roman" w:hAnsi="Times New Roman" w:cs="Times New Roman"/>
+          <w:sz w:val="24"/>
+          <w:szCs w:val="24"/>
+        </w:rPr>
+        <w:t xml:space="preserve"> </w:t>
+      </w:r>
+      <w:proofErr w:type="spellStart"/>
+      <w:r>
+        <w:rPr>
+          <w:rFonts w:ascii="Times New Roman" w:hAnsi="Times New Roman" w:cs="Times New Roman"/>
+          <w:sz w:val="24"/>
+          <w:szCs w:val="24"/>
+        </w:rPr>
+        <w:t>sampah</w:t>
+      </w:r>
+      <w:proofErr w:type="spellEnd"/>
+      <w:r>
+        <w:rPr>
+          <w:rFonts w:ascii="Times New Roman" w:hAnsi="Times New Roman" w:cs="Times New Roman"/>
+          <w:sz w:val="24"/>
+          <w:szCs w:val="24"/>
+        </w:rPr>
+        <w:t xml:space="preserve"> </w:t>
+      </w:r>
+      <w:proofErr w:type="spellStart"/>
+      <w:r>
+        <w:rPr>
+          <w:rFonts w:ascii="Times New Roman" w:hAnsi="Times New Roman" w:cs="Times New Roman"/>
+          <w:sz w:val="24"/>
+          <w:szCs w:val="24"/>
+        </w:rPr>
+        <w:t>kota</w:t>
+      </w:r>
+      <w:proofErr w:type="spellEnd"/>
+      <w:r>
+        <w:rPr>
+          <w:rFonts w:ascii="Times New Roman" w:hAnsi="Times New Roman" w:cs="Times New Roman"/>
+          <w:sz w:val="24"/>
+          <w:szCs w:val="24"/>
+        </w:rPr>
+        <w:t xml:space="preserve">, </w:t>
+      </w:r>
+      <w:proofErr w:type="spellStart"/>
+      <w:r>
+        <w:rPr>
+          <w:rFonts w:ascii="Times New Roman" w:hAnsi="Times New Roman" w:cs="Times New Roman"/>
+          <w:sz w:val="24"/>
+          <w:szCs w:val="24"/>
+        </w:rPr>
+        <w:t>sehingga</w:t>
+      </w:r>
+      <w:proofErr w:type="spellEnd"/>
+      <w:r>
+        <w:rPr>
+          <w:rFonts w:ascii="Times New Roman" w:hAnsi="Times New Roman" w:cs="Times New Roman"/>
+          <w:sz w:val="24"/>
+          <w:szCs w:val="24"/>
+        </w:rPr>
+        <w:t xml:space="preserve"> proses dan </w:t>
+      </w:r>
+      <w:proofErr w:type="spellStart"/>
+      <w:r>
+        <w:rPr>
+          <w:rFonts w:ascii="Times New Roman" w:hAnsi="Times New Roman" w:cs="Times New Roman"/>
+          <w:sz w:val="24"/>
+          <w:szCs w:val="24"/>
+        </w:rPr>
+        <w:t>pemilahan</w:t>
+      </w:r>
+      <w:proofErr w:type="spellEnd"/>
+      <w:r>
+        <w:rPr>
+          <w:rFonts w:ascii="Times New Roman" w:hAnsi="Times New Roman" w:cs="Times New Roman"/>
+          <w:sz w:val="24"/>
+          <w:szCs w:val="24"/>
+        </w:rPr>
+        <w:t xml:space="preserve"> </w:t>
+      </w:r>
+      <w:proofErr w:type="spellStart"/>
+      <w:r>
+        <w:rPr>
+          <w:rFonts w:ascii="Times New Roman" w:hAnsi="Times New Roman" w:cs="Times New Roman"/>
+          <w:sz w:val="24"/>
+          <w:szCs w:val="24"/>
+        </w:rPr>
+        <w:t>sampah</w:t>
+      </w:r>
+      <w:proofErr w:type="spellEnd"/>
+      <w:r>
+        <w:rPr>
+          <w:rFonts w:ascii="Times New Roman" w:hAnsi="Times New Roman" w:cs="Times New Roman"/>
+          <w:sz w:val="24"/>
+          <w:szCs w:val="24"/>
+        </w:rPr>
+        <w:t xml:space="preserve"> </w:t>
+      </w:r>
+      <w:proofErr w:type="spellStart"/>
+      <w:r>
+        <w:rPr>
+          <w:rFonts w:ascii="Times New Roman" w:hAnsi="Times New Roman" w:cs="Times New Roman"/>
+          <w:sz w:val="24"/>
+          <w:szCs w:val="24"/>
+        </w:rPr>
+        <w:t>dapat</w:t>
+      </w:r>
+      <w:proofErr w:type="spellEnd"/>
+      <w:r>
+        <w:rPr>
+          <w:rFonts w:ascii="Times New Roman" w:hAnsi="Times New Roman" w:cs="Times New Roman"/>
+          <w:sz w:val="24"/>
+          <w:szCs w:val="24"/>
+        </w:rPr>
+        <w:t xml:space="preserve"> </w:t>
+      </w:r>
+      <w:proofErr w:type="spellStart"/>
+      <w:r>
+        <w:rPr>
+          <w:rFonts w:ascii="Times New Roman" w:hAnsi="Times New Roman" w:cs="Times New Roman"/>
+          <w:sz w:val="24"/>
+          <w:szCs w:val="24"/>
+        </w:rPr>
+        <w:t>dilakukan</w:t>
+      </w:r>
+      <w:proofErr w:type="spellEnd"/>
+      <w:r>
+        <w:rPr>
+          <w:rFonts w:ascii="Times New Roman" w:hAnsi="Times New Roman" w:cs="Times New Roman"/>
+          <w:sz w:val="24"/>
+          <w:szCs w:val="24"/>
+        </w:rPr>
+        <w:t xml:space="preserve"> </w:t>
+      </w:r>
+      <w:proofErr w:type="spellStart"/>
+      <w:r>
+        <w:rPr>
+          <w:rFonts w:ascii="Times New Roman" w:hAnsi="Times New Roman" w:cs="Times New Roman"/>
+          <w:sz w:val="24"/>
+          <w:szCs w:val="24"/>
+        </w:rPr>
+        <w:t>lebih</w:t>
+      </w:r>
+      <w:proofErr w:type="spellEnd"/>
+      <w:r>
+        <w:rPr>
+          <w:rFonts w:ascii="Times New Roman" w:hAnsi="Times New Roman" w:cs="Times New Roman"/>
+          <w:sz w:val="24"/>
+          <w:szCs w:val="24"/>
+        </w:rPr>
+        <w:t xml:space="preserve"> </w:t>
+      </w:r>
+      <w:proofErr w:type="spellStart"/>
+      <w:r>
+        <w:rPr>
+          <w:rFonts w:ascii="Times New Roman" w:hAnsi="Times New Roman" w:cs="Times New Roman"/>
+          <w:sz w:val="24"/>
+          <w:szCs w:val="24"/>
+        </w:rPr>
+        <w:t>cepat</w:t>
+      </w:r>
+      <w:proofErr w:type="spellEnd"/>
+      <w:r>
+        <w:rPr>
+          <w:rFonts w:ascii="Times New Roman" w:hAnsi="Times New Roman" w:cs="Times New Roman"/>
+          <w:sz w:val="24"/>
+          <w:szCs w:val="24"/>
+        </w:rPr>
+        <w:t xml:space="preserve"> dan </w:t>
+      </w:r>
+      <w:proofErr w:type="spellStart"/>
+      <w:r>
+        <w:rPr>
+          <w:rFonts w:ascii="Times New Roman" w:hAnsi="Times New Roman" w:cs="Times New Roman"/>
+          <w:sz w:val="24"/>
+          <w:szCs w:val="24"/>
+        </w:rPr>
+        <w:t>terukur</w:t>
+      </w:r>
+      <w:proofErr w:type="spellEnd"/>
+      <w:r>
+        <w:rPr>
+          <w:rFonts w:ascii="Times New Roman" w:hAnsi="Times New Roman" w:cs="Times New Roman"/>
+          <w:sz w:val="24"/>
+          <w:szCs w:val="24"/>
+        </w:rPr>
+        <w:t>.</w:t>
+      </w:r>
+    </w:p>
+    <w:p>
+      <w:pPr>
+        <w:rPr>
+          <w:rFonts w:ascii="Times New Roman" w:hAnsi="Times New Roman" w:cs="Times New Roman"/>
+          <w:sz w:val="24"/>
+          <w:szCs w:val="24"/>
+        </w:rPr>
+      </w:pPr>
+      <w:bookmarkStart w:id="6" w:name="_GoBack"/>
       <w:bookmarkEnd w:id="6"/>
-      <w:proofErr w:type="spellEnd"/>
     </w:p>
     <w:p>
       <w:pPr>
@@ -5952,6 +8180,7 @@
           <w:bCs/>
           <w:color w:val="000000" w:themeColor="text1"/>
         </w:rPr>
+        <w:lastRenderedPageBreak/>
         <w:t>BAB II</w:t>
       </w:r>
       <w:bookmarkEnd w:id="7"/>
@@ -6614,7 +8843,6 @@
           <w:bCs/>
           <w:color w:val="000000" w:themeColor="text1"/>
         </w:rPr>
-        <w:lastRenderedPageBreak/>
         <w:t>BAB IV</w:t>
       </w:r>
       <w:bookmarkEnd w:id="19"/>
@@ -9274,6 +11502,92 @@
     </w:lvl>
   </w:abstractNum>
   <w:abstractNum w:abstractNumId="26" w15:restartNumberingAfterBreak="0">
+    <w:nsid w:val="3E784B8B"/>
+    <w:multiLevelType w:val="hybridMultilevel"/>
+    <w:tmpl w:val="A1829010"/>
+    <w:lvl w:ilvl="0" w:tplc="3809000F">
+      <w:start w:val="1"/>
+      <w:numFmt w:val="decimal"/>
+      <w:lvlText w:val="%1."/>
+      <w:lvlJc w:val="left"/>
+      <w:pPr>
+        <w:ind w:left="1500" w:hanging="360"/>
+      </w:pPr>
+    </w:lvl>
+    <w:lvl w:ilvl="1" w:tplc="38090019" w:tentative="1">
+      <w:start w:val="1"/>
+      <w:numFmt w:val="lowerLetter"/>
+      <w:lvlText w:val="%2."/>
+      <w:lvlJc w:val="left"/>
+      <w:pPr>
+        <w:ind w:left="2220" w:hanging="360"/>
+      </w:pPr>
+    </w:lvl>
+    <w:lvl w:ilvl="2" w:tplc="3809001B" w:tentative="1">
+      <w:start w:val="1"/>
+      <w:numFmt w:val="lowerRoman"/>
+      <w:lvlText w:val="%3."/>
+      <w:lvlJc w:val="right"/>
+      <w:pPr>
+        <w:ind w:left="2940" w:hanging="180"/>
+      </w:pPr>
+    </w:lvl>
+    <w:lvl w:ilvl="3" w:tplc="3809000F" w:tentative="1">
+      <w:start w:val="1"/>
+      <w:numFmt w:val="decimal"/>
+      <w:lvlText w:val="%4."/>
+      <w:lvlJc w:val="left"/>
+      <w:pPr>
+        <w:ind w:left="3660" w:hanging="360"/>
+      </w:pPr>
+    </w:lvl>
+    <w:lvl w:ilvl="4" w:tplc="38090019" w:tentative="1">
+      <w:start w:val="1"/>
+      <w:numFmt w:val="lowerLetter"/>
+      <w:lvlText w:val="%5."/>
+      <w:lvlJc w:val="left"/>
+      <w:pPr>
+        <w:ind w:left="4380" w:hanging="360"/>
+      </w:pPr>
+    </w:lvl>
+    <w:lvl w:ilvl="5" w:tplc="3809001B" w:tentative="1">
+      <w:start w:val="1"/>
+      <w:numFmt w:val="lowerRoman"/>
+      <w:lvlText w:val="%6."/>
+      <w:lvlJc w:val="right"/>
+      <w:pPr>
+        <w:ind w:left="5100" w:hanging="180"/>
+      </w:pPr>
+    </w:lvl>
+    <w:lvl w:ilvl="6" w:tplc="3809000F" w:tentative="1">
+      <w:start w:val="1"/>
+      <w:numFmt w:val="decimal"/>
+      <w:lvlText w:val="%7."/>
+      <w:lvlJc w:val="left"/>
+      <w:pPr>
+        <w:ind w:left="5820" w:hanging="360"/>
+      </w:pPr>
+    </w:lvl>
+    <w:lvl w:ilvl="7" w:tplc="38090019" w:tentative="1">
+      <w:start w:val="1"/>
+      <w:numFmt w:val="lowerLetter"/>
+      <w:lvlText w:val="%8."/>
+      <w:lvlJc w:val="left"/>
+      <w:pPr>
+        <w:ind w:left="6540" w:hanging="360"/>
+      </w:pPr>
+    </w:lvl>
+    <w:lvl w:ilvl="8" w:tplc="3809001B" w:tentative="1">
+      <w:start w:val="1"/>
+      <w:numFmt w:val="lowerRoman"/>
+      <w:lvlText w:val="%9."/>
+      <w:lvlJc w:val="right"/>
+      <w:pPr>
+        <w:ind w:left="7260" w:hanging="180"/>
+      </w:pPr>
+    </w:lvl>
+  </w:abstractNum>
+  <w:abstractNum w:abstractNumId="27" w15:restartNumberingAfterBreak="0">
     <w:nsid w:val="436E06B3"/>
     <w:multiLevelType w:val="hybridMultilevel"/>
     <w:tmpl w:val="45BA4E58"/>
@@ -9359,7 +11673,7 @@
       </w:pPr>
     </w:lvl>
   </w:abstractNum>
-  <w:abstractNum w:abstractNumId="27" w15:restartNumberingAfterBreak="0">
+  <w:abstractNum w:abstractNumId="28" w15:restartNumberingAfterBreak="0">
     <w:nsid w:val="446B7A65"/>
     <w:multiLevelType w:val="hybridMultilevel"/>
     <w:tmpl w:val="A7841CCE"/>
@@ -9445,7 +11759,7 @@
       </w:pPr>
     </w:lvl>
   </w:abstractNum>
-  <w:abstractNum w:abstractNumId="28" w15:restartNumberingAfterBreak="0">
+  <w:abstractNum w:abstractNumId="29" w15:restartNumberingAfterBreak="0">
     <w:nsid w:val="45592E9C"/>
     <w:multiLevelType w:val="hybridMultilevel"/>
     <w:tmpl w:val="DCBA83A4"/>
@@ -9535,7 +11849,7 @@
       </w:pPr>
     </w:lvl>
   </w:abstractNum>
-  <w:abstractNum w:abstractNumId="29" w15:restartNumberingAfterBreak="0">
+  <w:abstractNum w:abstractNumId="30" w15:restartNumberingAfterBreak="0">
     <w:nsid w:val="4AF276C4"/>
     <w:multiLevelType w:val="hybridMultilevel"/>
     <w:tmpl w:val="324871FC"/>
@@ -9624,7 +11938,7 @@
       </w:pPr>
     </w:lvl>
   </w:abstractNum>
-  <w:abstractNum w:abstractNumId="30" w15:restartNumberingAfterBreak="0">
+  <w:abstractNum w:abstractNumId="31" w15:restartNumberingAfterBreak="0">
     <w:nsid w:val="4D3000D3"/>
     <w:multiLevelType w:val="hybridMultilevel"/>
     <w:tmpl w:val="83A4CA72"/>
@@ -9713,7 +12027,7 @@
       </w:pPr>
     </w:lvl>
   </w:abstractNum>
-  <w:abstractNum w:abstractNumId="31" w15:restartNumberingAfterBreak="0">
+  <w:abstractNum w:abstractNumId="32" w15:restartNumberingAfterBreak="0">
     <w:nsid w:val="4E514FEB"/>
     <w:multiLevelType w:val="hybridMultilevel"/>
     <w:tmpl w:val="7F7642F0"/>
@@ -9799,7 +12113,7 @@
       </w:pPr>
     </w:lvl>
   </w:abstractNum>
-  <w:abstractNum w:abstractNumId="32" w15:restartNumberingAfterBreak="0">
+  <w:abstractNum w:abstractNumId="33" w15:restartNumberingAfterBreak="0">
     <w:nsid w:val="50E22691"/>
     <w:multiLevelType w:val="hybridMultilevel"/>
     <w:tmpl w:val="F9A61652"/>
@@ -9888,7 +12202,7 @@
       </w:pPr>
     </w:lvl>
   </w:abstractNum>
-  <w:abstractNum w:abstractNumId="33" w15:restartNumberingAfterBreak="0">
+  <w:abstractNum w:abstractNumId="34" w15:restartNumberingAfterBreak="0">
     <w:nsid w:val="5314732B"/>
     <w:multiLevelType w:val="hybridMultilevel"/>
     <w:tmpl w:val="F48094D4"/>
@@ -9977,7 +12291,7 @@
       </w:pPr>
     </w:lvl>
   </w:abstractNum>
-  <w:abstractNum w:abstractNumId="34" w15:restartNumberingAfterBreak="0">
+  <w:abstractNum w:abstractNumId="35" w15:restartNumberingAfterBreak="0">
     <w:nsid w:val="55C93998"/>
     <w:multiLevelType w:val="hybridMultilevel"/>
     <w:tmpl w:val="52C4B542"/>
@@ -10068,7 +12382,7 @@
       </w:pPr>
     </w:lvl>
   </w:abstractNum>
-  <w:abstractNum w:abstractNumId="35" w15:restartNumberingAfterBreak="0">
+  <w:abstractNum w:abstractNumId="36" w15:restartNumberingAfterBreak="0">
     <w:nsid w:val="659D7B7A"/>
     <w:multiLevelType w:val="hybridMultilevel"/>
     <w:tmpl w:val="F1B8AF22"/>
@@ -10158,7 +12472,7 @@
       </w:pPr>
     </w:lvl>
   </w:abstractNum>
-  <w:abstractNum w:abstractNumId="36" w15:restartNumberingAfterBreak="0">
+  <w:abstractNum w:abstractNumId="37" w15:restartNumberingAfterBreak="0">
     <w:nsid w:val="6731208F"/>
     <w:multiLevelType w:val="multilevel"/>
     <w:tmpl w:val="3809001F"/>
@@ -10244,7 +12558,7 @@
       </w:pPr>
     </w:lvl>
   </w:abstractNum>
-  <w:abstractNum w:abstractNumId="37" w15:restartNumberingAfterBreak="0">
+  <w:abstractNum w:abstractNumId="38" w15:restartNumberingAfterBreak="0">
     <w:nsid w:val="68A664F7"/>
     <w:multiLevelType w:val="hybridMultilevel"/>
     <w:tmpl w:val="3E722020"/>
@@ -10330,7 +12644,7 @@
       </w:pPr>
     </w:lvl>
   </w:abstractNum>
-  <w:abstractNum w:abstractNumId="38" w15:restartNumberingAfterBreak="0">
+  <w:abstractNum w:abstractNumId="39" w15:restartNumberingAfterBreak="0">
     <w:nsid w:val="6C374C59"/>
     <w:multiLevelType w:val="hybridMultilevel"/>
     <w:tmpl w:val="574ED282"/>
@@ -10416,7 +12730,7 @@
       </w:pPr>
     </w:lvl>
   </w:abstractNum>
-  <w:abstractNum w:abstractNumId="39" w15:restartNumberingAfterBreak="0">
+  <w:abstractNum w:abstractNumId="40" w15:restartNumberingAfterBreak="0">
     <w:nsid w:val="6C3F0266"/>
     <w:multiLevelType w:val="hybridMultilevel"/>
     <w:tmpl w:val="1AA0D5A8"/>
@@ -10507,7 +12821,7 @@
       </w:pPr>
     </w:lvl>
   </w:abstractNum>
-  <w:abstractNum w:abstractNumId="40" w15:restartNumberingAfterBreak="0">
+  <w:abstractNum w:abstractNumId="41" w15:restartNumberingAfterBreak="0">
     <w:nsid w:val="6F9D1B67"/>
     <w:multiLevelType w:val="hybridMultilevel"/>
     <w:tmpl w:val="A7841CCE"/>
@@ -10593,7 +12907,7 @@
       </w:pPr>
     </w:lvl>
   </w:abstractNum>
-  <w:abstractNum w:abstractNumId="41" w15:restartNumberingAfterBreak="0">
+  <w:abstractNum w:abstractNumId="42" w15:restartNumberingAfterBreak="0">
     <w:nsid w:val="74B35933"/>
     <w:multiLevelType w:val="hybridMultilevel"/>
     <w:tmpl w:val="D4AEBE16"/>
@@ -10682,7 +12996,7 @@
       </w:pPr>
     </w:lvl>
   </w:abstractNum>
-  <w:abstractNum w:abstractNumId="42" w15:restartNumberingAfterBreak="0">
+  <w:abstractNum w:abstractNumId="43" w15:restartNumberingAfterBreak="0">
     <w:nsid w:val="79382432"/>
     <w:multiLevelType w:val="hybridMultilevel"/>
     <w:tmpl w:val="2C68FE82"/>
@@ -10791,13 +13105,13 @@
     <w:abstractNumId w:val="17"/>
   </w:num>
   <w:num w:numId="6">
-    <w:abstractNumId w:val="38"/>
+    <w:abstractNumId w:val="39"/>
   </w:num>
   <w:num w:numId="7">
-    <w:abstractNumId w:val="33"/>
+    <w:abstractNumId w:val="34"/>
   </w:num>
   <w:num w:numId="8">
-    <w:abstractNumId w:val="36"/>
+    <w:abstractNumId w:val="37"/>
   </w:num>
   <w:num w:numId="9">
     <w:abstractNumId w:val="24"/>
@@ -10809,13 +13123,13 @@
     <w:abstractNumId w:val="1"/>
   </w:num>
   <w:num w:numId="12">
+    <w:abstractNumId w:val="43"/>
+  </w:num>
+  <w:num w:numId="13">
     <w:abstractNumId w:val="42"/>
   </w:num>
-  <w:num w:numId="13">
-    <w:abstractNumId w:val="41"/>
-  </w:num>
   <w:num w:numId="14">
-    <w:abstractNumId w:val="29"/>
+    <w:abstractNumId w:val="30"/>
   </w:num>
   <w:num w:numId="15">
     <w:abstractNumId w:val="4"/>
@@ -10824,22 +13138,22 @@
     <w:abstractNumId w:val="8"/>
   </w:num>
   <w:num w:numId="17">
-    <w:abstractNumId w:val="37"/>
+    <w:abstractNumId w:val="38"/>
   </w:num>
   <w:num w:numId="18">
     <w:abstractNumId w:val="6"/>
   </w:num>
   <w:num w:numId="19">
-    <w:abstractNumId w:val="31"/>
+    <w:abstractNumId w:val="32"/>
   </w:num>
   <w:num w:numId="20">
-    <w:abstractNumId w:val="26"/>
+    <w:abstractNumId w:val="27"/>
   </w:num>
   <w:num w:numId="21">
-    <w:abstractNumId w:val="40"/>
+    <w:abstractNumId w:val="41"/>
   </w:num>
   <w:num w:numId="22">
-    <w:abstractNumId w:val="27"/>
+    <w:abstractNumId w:val="28"/>
   </w:num>
   <w:num w:numId="23">
     <w:abstractNumId w:val="16"/>
@@ -10851,7 +13165,7 @@
     <w:abstractNumId w:val="18"/>
   </w:num>
   <w:num w:numId="26">
-    <w:abstractNumId w:val="35"/>
+    <w:abstractNumId w:val="36"/>
   </w:num>
   <w:num w:numId="27">
     <w:abstractNumId w:val="19"/>
@@ -10860,13 +13174,13 @@
     <w:abstractNumId w:val="11"/>
   </w:num>
   <w:num w:numId="29">
-    <w:abstractNumId w:val="30"/>
+    <w:abstractNumId w:val="31"/>
   </w:num>
   <w:num w:numId="30">
     <w:abstractNumId w:val="2"/>
   </w:num>
   <w:num w:numId="31">
-    <w:abstractNumId w:val="28"/>
+    <w:abstractNumId w:val="29"/>
   </w:num>
   <w:num w:numId="32">
     <w:abstractNumId w:val="14"/>
@@ -10878,7 +13192,7 @@
     <w:abstractNumId w:val="15"/>
   </w:num>
   <w:num w:numId="35">
-    <w:abstractNumId w:val="32"/>
+    <w:abstractNumId w:val="33"/>
   </w:num>
   <w:num w:numId="36">
     <w:abstractNumId w:val="5"/>
@@ -10887,13 +13201,13 @@
     <w:abstractNumId w:val="10"/>
   </w:num>
   <w:num w:numId="38">
-    <w:abstractNumId w:val="39"/>
+    <w:abstractNumId w:val="40"/>
   </w:num>
   <w:num w:numId="39">
     <w:abstractNumId w:val="7"/>
   </w:num>
   <w:num w:numId="40">
-    <w:abstractNumId w:val="34"/>
+    <w:abstractNumId w:val="35"/>
   </w:num>
   <w:num w:numId="41">
     <w:abstractNumId w:val="9"/>
@@ -10903,6 +13217,9 @@
   </w:num>
   <w:num w:numId="43">
     <w:abstractNumId w:val="22"/>
+  </w:num>
+  <w:num w:numId="44">
+    <w:abstractNumId w:val="26"/>
   </w:num>
   <w:numIdMacAtCleanup w:val="5"/>
 </w:numbering>
@@ -11978,7 +14295,7 @@
 </file>
 
 <file path=customXml/itemProps1.xml><?xml version="1.0" encoding="utf-8"?>
-<ds:datastoreItem xmlns:ds="http://schemas.openxmlformats.org/officeDocument/2006/customXml" ds:itemID="{37B5719C-D9FA-4C72-A650-61B7A181C518}">
+<ds:datastoreItem xmlns:ds="http://schemas.openxmlformats.org/officeDocument/2006/customXml" ds:itemID="{6718B2AB-3325-47B6-94A9-F061691C8E81}">
   <ds:schemaRefs>
     <ds:schemaRef ds:uri="http://schemas.openxmlformats.org/officeDocument/2006/bibliography"/>
   </ds:schemaRefs>

</xml_diff>